<commit_message>
docs(testing-course): compact use case with screenshots, TNR 14 everywhere, readable data table
</commit_message>
<xml_diff>
--- a/testing-course/reports/lab2/output/note.docx
+++ b/testing-course/reports/lab2/output/note.docx
@@ -428,46 +428,7 @@
         <w:t>UC-01.</w:t>
       </w:r>
       <w:r>
-        <w:rPr>
-          <w:i/>
-        </w:rPr>
-        <w:t xml:space="preserve"> Подать заявку в лист ожидания (форма </w:t>
-      </w:r>
-      <w:r>
-        <w:rPr>
-          <w:i/>
-        </w:rPr>
-        <w:t>«Записаться в бету»</w:t>
-      </w:r>
-      <w:r>
-        <w:t>* на главной странице DSLKit).</w:t>
-      </w:r>
-    </w:p>
-    <w:p>
-      <w:pPr>
-        <w:ind w:firstLine="709"/>
-        <w:jc w:val="both"/>
-      </w:pPr>
-      <w:r>
-        <w:t>*</w:t>
-      </w:r>
-      <w:r>
-        <w:rPr>
-          <w:i/>
-        </w:rPr>
-        <w:t>Идентификатор, версия, приоритет.</w:t>
-      </w:r>
-      <w:r>
-        <w:t>*</w:t>
-      </w:r>
-    </w:p>
-    <w:p>
-      <w:pPr>
-        <w:ind w:firstLine="709"/>
-        <w:jc w:val="both"/>
-      </w:pPr>
-      <w:r>
-        <w:t>– UC-01, версия 1.0, приоритет High: единственный способ оставить контакты для получения приглашения в бету.</w:t>
+        <w:t>* Подать заявку в лист ожидания.</w:t>
       </w:r>
     </w:p>
     <w:p>
@@ -515,7 +476,7 @@
         <w:rPr>
           <w:i/>
         </w:rPr>
-        <w:t xml:space="preserve"> — веб-приложение «Редактор диаграмм как кода: слева текст, справа диаграмма», статический сайт без серверной части (каталог </w:t>
+        <w:t xml:space="preserve"> — редактор диаграмм как кода (статический сайт, </w:t>
       </w:r>
       <w:r>
         <w:t>site/*);</w:t>
@@ -536,7 +497,7 @@
         <w:t>Модуль:</w:t>
       </w:r>
       <w:r>
-        <w:t>* «Лист ожидания беты» — форма заявки на главной странице (раздел «Записаться в бету»);</w:t>
+        <w:t>* «Лист ожидания беты» — форма на главной странице;</w:t>
       </w:r>
     </w:p>
     <w:p>
@@ -551,85 +512,10 @@
         <w:rPr>
           <w:i/>
         </w:rPr>
-        <w:t>Ссылка на модуль:</w:t>
+        <w:t>Ссылка:</w:t>
       </w:r>
       <w:r>
-        <w:rPr>
-          <w:i/>
-        </w:rPr>
-        <w:t xml:space="preserve"> http://localhost:5173/#waitlist (запуск: </w:t>
-      </w:r>
-      <w:r>
-        <w:t>npm start*);</w:t>
-      </w:r>
-    </w:p>
-    <w:p>
-      <w:pPr>
-        <w:ind w:firstLine="709"/>
-        <w:jc w:val="both"/>
-      </w:pPr>
-      <w:r>
-        <w:t>– *</w:t>
-      </w:r>
-      <w:r>
-        <w:rPr>
-          <w:i/>
-        </w:rPr>
-        <w:t>Ссылка на исходный код:</w:t>
-      </w:r>
-      <w:r>
-        <w:rPr>
-          <w:i/>
-        </w:rPr>
-        <w:t xml:space="preserve"> https://github.com/KsushaKhadzhinova/DSLKit-Project, файлы </w:t>
-      </w:r>
-      <w:r>
-        <w:t>site/index.html</w:t>
-      </w:r>
-      <w:r>
-        <w:rPr>
-          <w:i/>
-        </w:rPr>
-        <w:t xml:space="preserve"> (форма </w:t>
-      </w:r>
-      <w:r>
-        <w:t>#waitlist-form</w:t>
-      </w:r>
-      <w:r>
-        <w:rPr>
-          <w:i/>
-        </w:rPr>
-        <w:t xml:space="preserve">) и </w:t>
-      </w:r>
-      <w:r>
-        <w:t>site/js/components/waitlist-form.js*.</w:t>
-      </w:r>
-    </w:p>
-    <w:p>
-      <w:pPr>
-        <w:ind w:firstLine="709"/>
-        <w:jc w:val="both"/>
-      </w:pPr>
-      <w:r>
-        <w:t>*</w:t>
-      </w:r>
-      <w:r>
-        <w:rPr>
-          <w:i/>
-        </w:rPr>
-        <w:t>Краткое описание цели и задачи.</w:t>
-      </w:r>
-      <w:r>
-        <w:t>*</w:t>
-      </w:r>
-    </w:p>
-    <w:p>
-      <w:pPr>
-        <w:ind w:firstLine="709"/>
-        <w:jc w:val="both"/>
-      </w:pPr>
-      <w:r>
-        <w:t>– Посетитель оставляет имя, почту, нотацию диаграмм и размер команды, чтобы команда DSLKit прислала ему приглашение, когда откроется бета. Задача формы: принять только корректную заявку, сохранить её и показать страницу благодарности.</w:t>
+        <w:t>* http://localhost:5173/#waitlist.</w:t>
       </w:r>
     </w:p>
     <w:p>
@@ -656,7 +542,7 @@
         <w:jc w:val="both"/>
       </w:pPr>
       <w:r>
-        <w:t>– Посетитель сайта (неавторизованный). Внешних систем и сервера в сценарии нет: заявка остаётся в браузере посетителя.</w:t>
+        <w:t>– Посетитель сайта (без регистрации и авторизации).</w:t>
       </w:r>
     </w:p>
     <w:p>
@@ -671,7 +557,7 @@
         <w:rPr>
           <w:i/>
         </w:rPr>
-        <w:t>Как перейти к форме.</w:t>
+        <w:t>Цель.</w:t>
       </w:r>
       <w:r>
         <w:t>*</w:t>
@@ -683,274 +569,7 @@
         <w:jc w:val="both"/>
       </w:pPr>
       <w:r>
-        <w:t>*</w:t>
-      </w:r>
-      <w:r>
-        <w:rPr>
-          <w:i/>
-        </w:rPr>
-        <w:t xml:space="preserve">Форма находится на главной странице сайта в разделе </w:t>
-      </w:r>
-      <w:r>
-        <w:rPr>
-          <w:i/>
-        </w:rPr>
-        <w:t>«Записаться в бету»</w:t>
-      </w:r>
-      <w:r>
-        <w:rPr>
-          <w:i/>
-        </w:rPr>
-        <w:t xml:space="preserve"> (якорь </w:t>
-      </w:r>
-      <w:r>
-        <w:t>#waitlist</w:t>
-      </w:r>
-      <w:r>
-        <w:rPr>
-          <w:i/>
-        </w:rPr>
-        <w:t xml:space="preserve">), доступна всем посетителям </w:t>
-      </w:r>
-      <w:r>
-        <w:rPr>
-          <w:i/>
-        </w:rPr>
-        <w:t>без регистрации и авторизации</w:t>
-      </w:r>
-      <w:r>
-        <w:rPr>
-          <w:i/>
-        </w:rPr>
-        <w:t>. Перейти к ней можно так:</w:t>
-      </w:r>
-      <w:r>
-        <w:t>*</w:t>
-      </w:r>
-    </w:p>
-    <w:p>
-      <w:pPr>
-        <w:ind w:firstLine="709"/>
-        <w:jc w:val="both"/>
-      </w:pPr>
-      <w:r>
-        <w:t>– *</w:t>
-      </w:r>
-      <w:r>
-        <w:rPr>
-          <w:i/>
-        </w:rPr>
-        <w:t>1.</w:t>
-      </w:r>
-      <w:r>
-        <w:rPr>
-          <w:i/>
-        </w:rPr>
-        <w:t xml:space="preserve"> Шапка главной страницы, кнопка </w:t>
-      </w:r>
-      <w:r>
-        <w:rPr>
-          <w:i/>
-        </w:rPr>
-        <w:t>«В бету»</w:t>
-      </w:r>
-      <w:r>
-        <w:rPr>
-          <w:i/>
-        </w:rPr>
-        <w:t xml:space="preserve"> (en: «Join the beta»), </w:t>
-      </w:r>
-      <w:r>
-        <w:t>site/index.html*, строка 67;</w:t>
-      </w:r>
-    </w:p>
-    <w:p>
-      <w:pPr>
-        <w:ind w:firstLine="709"/>
-        <w:jc w:val="both"/>
-      </w:pPr>
-      <w:r>
-        <w:t>– *</w:t>
-      </w:r>
-      <w:r>
-        <w:rPr>
-          <w:i/>
-        </w:rPr>
-        <w:t>2.</w:t>
-      </w:r>
-      <w:r>
-        <w:rPr>
-          <w:i/>
-        </w:rPr>
-        <w:t xml:space="preserve"> Первый экран, кнопка </w:t>
-      </w:r>
-      <w:r>
-        <w:rPr>
-          <w:i/>
-        </w:rPr>
-        <w:t>«Записаться в бету»</w:t>
-      </w:r>
-      <w:r>
-        <w:t>*, строка 88;</w:t>
-      </w:r>
-    </w:p>
-    <w:p>
-      <w:pPr>
-        <w:ind w:firstLine="709"/>
-        <w:jc w:val="both"/>
-      </w:pPr>
-      <w:r>
-        <w:t>– *</w:t>
-      </w:r>
-      <w:r>
-        <w:rPr>
-          <w:i/>
-        </w:rPr>
-        <w:t>3.</w:t>
-      </w:r>
-      <w:r>
-        <w:rPr>
-          <w:i/>
-        </w:rPr>
-        <w:t xml:space="preserve"> Раздел «Нотации»: шесть ссылок </w:t>
-      </w:r>
-      <w:r>
-        <w:rPr>
-          <w:i/>
-        </w:rPr>
-        <w:t>«Записаться в бету: UML / BPMN / ERD / DFD / IDEF0 / сети Петри»</w:t>
-      </w:r>
-      <w:r>
-        <w:t>*, строки 127–172;</w:t>
-      </w:r>
-    </w:p>
-    <w:p>
-      <w:pPr>
-        <w:ind w:firstLine="709"/>
-        <w:jc w:val="both"/>
-      </w:pPr>
-      <w:r>
-        <w:t>– *</w:t>
-      </w:r>
-      <w:r>
-        <w:rPr>
-          <w:i/>
-        </w:rPr>
-        <w:t>4.</w:t>
-      </w:r>
-      <w:r>
-        <w:rPr>
-          <w:i/>
-        </w:rPr>
-        <w:t xml:space="preserve"> Страницы </w:t>
-      </w:r>
-      <w:r>
-        <w:t>privacy.html</w:t>
-      </w:r>
-      <w:r>
-        <w:rPr>
-          <w:i/>
-        </w:rPr>
-        <w:t xml:space="preserve"> и </w:t>
-      </w:r>
-      <w:r>
-        <w:t>thanks.html</w:t>
-      </w:r>
-      <w:r>
-        <w:rPr>
-          <w:i/>
-        </w:rPr>
-        <w:t xml:space="preserve">: кнопка </w:t>
-      </w:r>
-      <w:r>
-        <w:rPr>
-          <w:i/>
-        </w:rPr>
-        <w:t>«В бету»</w:t>
-      </w:r>
-      <w:r>
-        <w:rPr>
-          <w:i/>
-        </w:rPr>
-        <w:t xml:space="preserve"> в шапке ведёт на </w:t>
-      </w:r>
-      <w:r>
-        <w:t>./#waitlist*;</w:t>
-      </w:r>
-    </w:p>
-    <w:p>
-      <w:pPr>
-        <w:ind w:firstLine="709"/>
-        <w:jc w:val="both"/>
-      </w:pPr>
-      <w:r>
-        <w:t>– *</w:t>
-      </w:r>
-      <w:r>
-        <w:rPr>
-          <w:i/>
-        </w:rPr>
-        <w:t>5.</w:t>
-      </w:r>
-      <w:r>
-        <w:t>* Прямой адрес: http://localhost:5173/#waitlist (русская версия), http://localhost:5173/en/#waitlist (английская);</w:t>
-      </w:r>
-    </w:p>
-    <w:p>
-      <w:pPr>
-        <w:ind w:firstLine="709"/>
-        <w:jc w:val="both"/>
-      </w:pPr>
-      <w:r>
-        <w:t>– *</w:t>
-      </w:r>
-      <w:r>
-        <w:rPr>
-          <w:i/>
-        </w:rPr>
-        <w:t>6.</w:t>
-      </w:r>
-      <w:r>
-        <w:t>* Клавиатура: Tab до кнопки или ссылки и Enter; ссылка-якорь прокручивает страницу к форме;</w:t>
-      </w:r>
-    </w:p>
-    <w:p>
-      <w:pPr>
-        <w:ind w:firstLine="709"/>
-        <w:jc w:val="both"/>
-      </w:pPr>
-      <w:r>
-        <w:t>– *</w:t>
-      </w:r>
-      <w:r>
-        <w:rPr>
-          <w:i/>
-        </w:rPr>
-        <w:t>7.</w:t>
-      </w:r>
-      <w:r>
-        <w:rPr>
-          <w:i/>
-        </w:rPr>
-        <w:t xml:space="preserve"> React-приложение (</w:t>
-      </w:r>
-      <w:r>
-        <w:t>react-app</w:t>
-      </w:r>
-      <w:r>
-        <w:rPr>
-          <w:i/>
-        </w:rPr>
-        <w:t xml:space="preserve">): кнопка </w:t>
-      </w:r>
-      <w:r>
-        <w:rPr>
-          <w:i/>
-        </w:rPr>
-        <w:t>«Записаться в бету»</w:t>
-      </w:r>
-      <w:r>
-        <w:t>* в шапке (UC-04, только сообщение, заявка не сохраняется).</w:t>
+        <w:t>– Оставить контакты, чтобы получить приглашение в бету DSLKit.</w:t>
       </w:r>
     </w:p>
     <w:p>
@@ -977,7 +596,25 @@
         <w:jc w:val="both"/>
       </w:pPr>
       <w:r>
-        <w:t>– 1. Открыта главная страница: русская (/) или английская (/en/);</w:t>
+        <w:t>– 1. Открыта главная страница (</w:t>
+      </w:r>
+      <w:r>
+        <w:rPr>
+          <w:i/>
+        </w:rPr>
+        <w:t>/</w:t>
+      </w:r>
+      <w:r>
+        <w:t xml:space="preserve"> или </w:t>
+      </w:r>
+      <w:r>
+        <w:rPr>
+          <w:i/>
+        </w:rPr>
+        <w:t>/en/</w:t>
+      </w:r>
+      <w:r>
+        <w:t>);</w:t>
       </w:r>
     </w:p>
     <w:p>
@@ -986,70 +623,7 @@
         <w:jc w:val="both"/>
       </w:pPr>
       <w:r>
-        <w:t>– 2. Раздел *</w:t>
-      </w:r>
-      <w:r>
-        <w:rPr>
-          <w:i/>
-        </w:rPr>
-        <w:t>«Записаться в бету»</w:t>
-      </w:r>
-      <w:r>
-        <w:rPr>
-          <w:i/>
-        </w:rPr>
-        <w:t xml:space="preserve"> показан, форма пуста: список </w:t>
-      </w:r>
-      <w:r>
-        <w:rPr>
-          <w:i/>
-        </w:rPr>
-        <w:t>«Нотация»</w:t>
-      </w:r>
-      <w:r>
-        <w:rPr>
-          <w:i/>
-        </w:rPr>
-        <w:t xml:space="preserve"> стоит на пункте </w:t>
-      </w:r>
-      <w:r>
-        <w:rPr>
-          <w:i/>
-        </w:rPr>
-        <w:t>«Выберите нотацию»</w:t>
-      </w:r>
-      <w:r>
-        <w:rPr>
-          <w:i/>
-        </w:rPr>
-        <w:t xml:space="preserve">, в поле </w:t>
-      </w:r>
-      <w:r>
-        <w:rPr>
-          <w:i/>
-        </w:rPr>
-        <w:t>«Размер команды»</w:t>
-      </w:r>
-      <w:r>
-        <w:t>* значение 0, флажок согласия снят;</w:t>
-      </w:r>
-    </w:p>
-    <w:p>
-      <w:pPr>
-        <w:ind w:firstLine="709"/>
-        <w:jc w:val="both"/>
-      </w:pPr>
-      <w:r>
-        <w:t xml:space="preserve">– 3. Скрипт </w:t>
-      </w:r>
-      <w:r>
-        <w:rPr>
-          <w:i/>
-        </w:rPr>
-        <w:t>site/js/script.js</w:t>
-      </w:r>
-      <w:r>
-        <w:t xml:space="preserve"> загружен (иначе форма не работает).</w:t>
+        <w:t>– 2. Форма пуста: нотация не выбрана, размер команды 0, согласие не отмечено.</w:t>
       </w:r>
     </w:p>
     <w:p>
@@ -1064,7 +638,7 @@
         <w:rPr>
           <w:i/>
         </w:rPr>
-        <w:t>Основной поток событий.</w:t>
+        <w:t>Основной поток.</w:t>
       </w:r>
       <w:r>
         <w:t>*</w:t>
@@ -1076,7 +650,7 @@
         <w:jc w:val="both"/>
       </w:pPr>
       <w:r>
-        <w:t>– 1. Посетитель переходит к форме одним из способов раздела «Как перейти к форме», например нажимает *</w:t>
+        <w:t>– 1. Посетитель нажимает *</w:t>
       </w:r>
       <w:r>
         <w:rPr>
@@ -1088,7 +662,7 @@
         <w:rPr>
           <w:i/>
         </w:rPr>
-        <w:t xml:space="preserve"> (или </w:t>
+        <w:t xml:space="preserve"> в шапке (или </w:t>
       </w:r>
       <w:r>
         <w:rPr>
@@ -1100,7 +674,7 @@
         <w:rPr>
           <w:i/>
         </w:rPr>
-        <w:t xml:space="preserve">); страница прокручивается к разделу </w:t>
+        <w:t xml:space="preserve">) и попадает к форме </w:t>
       </w:r>
       <w:r>
         <w:t>#waitlist*;</w:t>
@@ -1112,7 +686,7 @@
         <w:jc w:val="both"/>
       </w:pPr>
       <w:r>
-        <w:t>– 2. Посетитель вводит имя в поле *</w:t>
+        <w:t>– 2. Вводит *</w:t>
       </w:r>
       <w:r>
         <w:rPr>
@@ -1127,16 +701,16 @@
         <w:rPr>
           <w:i/>
         </w:rPr>
-        <w:t xml:space="preserve"> (подсказка </w:t>
+        <w:t xml:space="preserve"> и </w:t>
       </w:r>
       <w:r>
         <w:rPr>
           <w:i/>
         </w:rPr>
-        <w:t>«От 2 до 60 букв. Допустимы пробел, дефис и апостроф.»</w:t>
+        <w:t>«Электронная почта\</w:t>
       </w:r>
       <w:r>
-        <w:t>*);</w:t>
+        <w:t>»**;</w:t>
       </w:r>
     </w:p>
     <w:p>
@@ -1145,31 +719,16 @@
         <w:jc w:val="both"/>
       </w:pPr>
       <w:r>
-        <w:t>– 3. Посетитель вводит адрес в поле *</w:t>
+        <w:t>– 3. Выбирает *</w:t>
       </w:r>
       <w:r>
         <w:rPr>
           <w:i/>
         </w:rPr>
-        <w:t>«Электронная почта\</w:t>
+        <w:t>«Нотация\</w:t>
       </w:r>
       <w:r>
-        <w:t>»*</w:t>
-      </w:r>
-      <w:r>
-        <w:rPr>
-          <w:i/>
-        </w:rPr>
-        <w:t xml:space="preserve"> (подсказка </w:t>
-      </w:r>
-      <w:r>
-        <w:rPr>
-          <w:i/>
-        </w:rPr>
-        <w:t>«Адрес вида name@example.com. На него придёт приглашение.»</w:t>
-      </w:r>
-      <w:r>
-        <w:t>*);</w:t>
+        <w:t>»** (IDEF0, DFD, ERD, BPMN, UML, «Сети Петри»);</w:t>
       </w:r>
     </w:p>
     <w:p>
@@ -1178,31 +737,7 @@
         <w:jc w:val="both"/>
       </w:pPr>
       <w:r>
-        <w:t>– 4. Посетитель выбирает нотацию в списке «Нотация\</w:t>
-      </w:r>
-      <w:r>
-        <w:rPr>
-          <w:i/>
-        </w:rPr>
-        <w:t xml:space="preserve">»: IDEF0, DFD, ERD, BPMN, UML или </w:t>
-      </w:r>
-      <w:r>
-        <w:rPr>
-          <w:i/>
-        </w:rPr>
-        <w:t>«Сети Петри»</w:t>
-      </w:r>
-      <w:r>
-        <w:t>*;</w:t>
-      </w:r>
-    </w:p>
-    <w:p>
-      <w:pPr>
-        <w:ind w:firstLine="709"/>
-        <w:jc w:val="both"/>
-      </w:pPr>
-      <w:r>
-        <w:t>– 5. Посетитель вводит целое число в поле *</w:t>
+        <w:t>– 4. Вводит *</w:t>
       </w:r>
       <w:r>
         <w:rPr>
@@ -1217,31 +752,13 @@
         <w:rPr>
           <w:i/>
         </w:rPr>
-        <w:t xml:space="preserve"> (подсказка </w:t>
+        <w:t xml:space="preserve"> (0–500) и при желании </w:t>
       </w:r>
       <w:r>
         <w:rPr>
           <w:i/>
         </w:rPr>
-        <w:t>«Целое число от 0 до 500. Укажите 0, если работаете один.»</w:t>
-      </w:r>
-      <w:r>
-        <w:t>*);</w:t>
-      </w:r>
-    </w:p>
-    <w:p>
-      <w:pPr>
-        <w:ind w:firstLine="709"/>
-        <w:jc w:val="both"/>
-      </w:pPr>
-      <w:r>
-        <w:t>– 6. Посетитель при желании вводит текст в поле *</w:t>
-      </w:r>
-      <w:r>
-        <w:rPr>
-          <w:i/>
-        </w:rPr>
-        <w:t>«Комментарий (по желанию)»</w:t>
+        <w:t>«Комментарий»</w:t>
       </w:r>
       <w:r>
         <w:t>*;</w:t>
@@ -1253,25 +770,13 @@
         <w:jc w:val="both"/>
       </w:pPr>
       <w:r>
-        <w:t>– 7. Посетитель отмечает флажок *</w:t>
+        <w:t>– 5. Отмечает согласие\</w:t>
       </w:r>
       <w:r>
         <w:rPr>
           <w:i/>
         </w:rPr>
-        <w:t>«Согласен получать письма о запуске беты и с политикой конфиденциальности\</w:t>
-      </w:r>
-      <w:r>
-        <w:t>»**;</w:t>
-      </w:r>
-    </w:p>
-    <w:p>
-      <w:pPr>
-        <w:ind w:firstLine="709"/>
-        <w:jc w:val="both"/>
-      </w:pPr>
-      <w:r>
-        <w:t>– 8. Посетитель нажимает кнопку *</w:t>
+        <w:t xml:space="preserve"> и нажимает </w:t>
       </w:r>
       <w:r>
         <w:rPr>
@@ -1289,7 +794,7 @@
         <w:jc w:val="both"/>
       </w:pPr>
       <w:r>
-        <w:t xml:space="preserve">– 9. Система считывает шесть полей и проверяет каждое по правилам П1–П6 из таблицы «Структура данных» (функция </w:t>
+        <w:t>– 6. Система проверяет поля по таблице «Структура данных» (</w:t>
       </w:r>
       <w:r>
         <w:rPr>
@@ -1307,7 +812,7 @@
         <w:jc w:val="both"/>
       </w:pPr>
       <w:r>
-        <w:t xml:space="preserve">– 10. Система формирует запись {name, email, notation, team, comment, createdAt}, где name, email и comment очищены от пробелов по краям, team приведён к числу, createdAt — время в формате ISO 8601; добавляет запись в массив </w:t>
+        <w:t xml:space="preserve">– 7. Система сохраняет заявку в </w:t>
       </w:r>
       <w:r>
         <w:rPr>
@@ -1316,7 +821,7 @@
         <w:t>LocalStorage</w:t>
       </w:r>
       <w:r>
-        <w:t xml:space="preserve"> по ключу </w:t>
+        <w:t xml:space="preserve"> (ключ </w:t>
       </w:r>
       <w:r>
         <w:rPr>
@@ -1325,16 +830,7 @@
         <w:t>dslkit.waitlist</w:t>
       </w:r>
       <w:r>
-        <w:t xml:space="preserve"> и пишет в консоль *</w:t>
-      </w:r>
-      <w:r>
-        <w:rPr>
-          <w:i/>
-        </w:rPr>
-        <w:t>«DSLKit: заявка сохранена в LocalStorage»</w:t>
-      </w:r>
-      <w:r>
-        <w:t>* с названием нотации;</w:t>
+        <w:t>);</w:t>
       </w:r>
     </w:p>
     <w:p>
@@ -1343,7 +839,7 @@
         <w:jc w:val="both"/>
       </w:pPr>
       <w:r>
-        <w:t xml:space="preserve">– 11. Система открывает страницу благодарности </w:t>
+        <w:t xml:space="preserve">– 8. Система открывает страницу благодарности </w:t>
       </w:r>
       <w:r>
         <w:rPr>
@@ -1352,25 +848,7 @@
         <w:t>thanks.html</w:t>
       </w:r>
       <w:r>
-        <w:t xml:space="preserve"> (для английской версии en/</w:t>
-      </w:r>
-      <w:r>
-        <w:rPr>
-          <w:i/>
-        </w:rPr>
-        <w:t>thanks.html</w:t>
-      </w:r>
-      <w:r>
-        <w:t>) с заголовком *</w:t>
-      </w:r>
-      <w:r>
-        <w:rPr>
-          <w:i/>
-        </w:rPr>
-        <w:t>«Спасибо, вы в списке беты»</w:t>
-      </w:r>
-      <w:r>
-        <w:t>*;</w:t>
+        <w:t>;</w:t>
       </w:r>
     </w:p>
     <w:p>
@@ -1379,7 +857,7 @@
         <w:jc w:val="both"/>
       </w:pPr>
       <w:r>
-        <w:t>– \* — обязательное поле. В интерфейсе сайта звёздочек нет, обязательность указана фразой «Все поля, кроме комментария, обязательны».</w:t>
+        <w:t>– \* — обязательное поле.</w:t>
       </w:r>
     </w:p>
     <w:p>
@@ -1412,34 +890,10 @@
         <w:rPr>
           <w:i/>
         </w:rPr>
-        <w:t>A1</w:t>
+        <w:t>A1.</w:t>
       </w:r>
       <w:r>
-        <w:rPr>
-          <w:i/>
-        </w:rPr>
-        <w:t xml:space="preserve">. Одно или несколько полей не прошли проверку (шаг 9): под каждым неверным полем показывается красное сообщение (role=alert, например </w:t>
-      </w:r>
-      <w:r>
-        <w:rPr>
-          <w:i/>
-        </w:rPr>
-        <w:t>«Имя не принято: поле пустое, короче двух символов или содержит цифры и знаки…»</w:t>
-      </w:r>
-      <w:r>
-        <w:rPr>
-          <w:i/>
-        </w:rPr>
-        <w:t xml:space="preserve">), поле получает aria-invalid=true, фокус переходит на первое неверное поле в порядке имя, почта, нотация, команда, комментарий, согласие. </w:t>
-      </w:r>
-      <w:r>
-        <w:rPr>
-          <w:i/>
-        </w:rPr>
-        <w:t>Заявка не сохраняется</w:t>
-      </w:r>
-      <w:r>
-        <w:t>*, страница не меняется. Поле с ошибкой перепроверяется при каждом вводе, остальные при выходе из поля. После исправления сообщение скрывается. Сценарий продолжается с шага 8;</w:t>
+        <w:t>* Поле неверно (шаг 6): под полем красное сообщение, фокус на первом неверном поле, заявка не сохраняется; после исправления сообщение исчезает;</w:t>
       </w:r>
     </w:p>
     <w:p>
@@ -1454,22 +908,10 @@
         <w:rPr>
           <w:i/>
         </w:rPr>
-        <w:t>A2</w:t>
+        <w:t>A2.</w:t>
       </w:r>
       <w:r>
-        <w:rPr>
-          <w:i/>
-        </w:rPr>
-        <w:t xml:space="preserve">. Согласие не отмечено (шаг 9): применяется A1; сообщение </w:t>
-      </w:r>
-      <w:r>
-        <w:rPr>
-          <w:i/>
-        </w:rPr>
-        <w:t>«Без согласия мы не можем отправить приглашение. Поставьте галочку, чтобы продолжить.»</w:t>
-      </w:r>
-      <w:r>
-        <w:t>*;</w:t>
+        <w:t>* Повторная заявка с той же почтой: принимается как новая запись (дефект D-1);</w:t>
       </w:r>
     </w:p>
     <w:p>
@@ -1484,70 +926,10 @@
         <w:rPr>
           <w:i/>
         </w:rPr>
-        <w:t>A3</w:t>
+        <w:t>A3.</w:t>
       </w:r>
       <w:r>
-        <w:t>*. Посетитель закрывает страницу или уходит со страницы до шага 8: данные не сохраняются, состояние системы не меняется;</w:t>
-      </w:r>
-    </w:p>
-    <w:p>
-      <w:pPr>
-        <w:ind w:firstLine="709"/>
-        <w:jc w:val="both"/>
-      </w:pPr>
-      <w:r>
-        <w:t>– *</w:t>
-      </w:r>
-      <w:r>
-        <w:rPr>
-          <w:i/>
-        </w:rPr>
-        <w:t>A4</w:t>
-      </w:r>
-      <w:r>
-        <w:rPr>
-          <w:i/>
-        </w:rPr>
-        <w:t xml:space="preserve">. Повторная заявка с тем же адресом (шаг 10): </w:t>
-      </w:r>
-      <w:r>
-        <w:rPr>
-          <w:i/>
-        </w:rPr>
-        <w:t>принимается как новая отдельная запись</w:t>
-      </w:r>
-      <w:r>
-        <w:t>*, сообщения о дубликате нет (дефект D-1);</w:t>
-      </w:r>
-    </w:p>
-    <w:p>
-      <w:pPr>
-        <w:ind w:firstLine="709"/>
-        <w:jc w:val="both"/>
-      </w:pPr>
-      <w:r>
-        <w:t>– *</w:t>
-      </w:r>
-      <w:r>
-        <w:rPr>
-          <w:i/>
-        </w:rPr>
-        <w:t>A5</w:t>
-      </w:r>
-      <w:r>
-        <w:rPr>
-          <w:i/>
-        </w:rPr>
-        <w:t xml:space="preserve">. Повторное нажатие </w:t>
-      </w:r>
-      <w:r>
-        <w:rPr>
-          <w:i/>
-        </w:rPr>
-        <w:t>«Отправить»</w:t>
-      </w:r>
-      <w:r>
-        <w:t>* после успешной отправки (шаг 11): игнорируется, вторая запись не создаётся (флаг submitting).</w:t>
+        <w:t>* Посетитель закрыл страницу до шага 5: данные не сохраняются.</w:t>
       </w:r>
     </w:p>
     <w:p>
@@ -1574,16 +956,7 @@
         <w:jc w:val="both"/>
       </w:pPr>
       <w:r>
-        <w:t xml:space="preserve">– Успех: массив </w:t>
-      </w:r>
-      <w:r>
-        <w:rPr>
-          <w:i/>
-        </w:rPr>
-        <w:t>dslkit.waitlist</w:t>
-      </w:r>
-      <w:r>
-        <w:t xml:space="preserve"> в </w:t>
+        <w:t xml:space="preserve">– Успех: в </w:t>
       </w:r>
       <w:r>
         <w:rPr>
@@ -1592,7 +965,7 @@
         <w:t>LocalStorage</w:t>
       </w:r>
       <w:r>
-        <w:t xml:space="preserve"> длиннее на одну запись, открыта страница </w:t>
+        <w:t xml:space="preserve"> на одну запись больше, открыта </w:t>
       </w:r>
       <w:r>
         <w:rPr>
@@ -1601,25 +974,7 @@
         <w:t>thanks.html</w:t>
       </w:r>
       <w:r>
-        <w:t xml:space="preserve"> (en/</w:t>
-      </w:r>
-      <w:r>
-        <w:rPr>
-          <w:i/>
-        </w:rPr>
-        <w:t>thanks.html</w:t>
-      </w:r>
-      <w:r>
-        <w:t>);</w:t>
-      </w:r>
-    </w:p>
-    <w:p>
-      <w:pPr>
-        <w:ind w:firstLine="709"/>
-        <w:jc w:val="both"/>
-      </w:pPr>
-      <w:r>
-        <w:t>– Ошибка проверки (A1, A2): записей не добавилось, посетитель остаётся на главной странице, введённые значения остаются в полях.</w:t>
+        <w:t>. Ошибка проверки: записей не добавилось, значения остаются в полях.</w:t>
       </w:r>
     </w:p>
     <w:p>
@@ -1652,13 +1007,13 @@
         <w:rPr>
           <w:i/>
         </w:rPr>
-        <w:t>E1</w:t>
+        <w:t>E1.</w:t>
       </w:r>
       <w:r>
         <w:rPr>
           <w:i/>
         </w:rPr>
-        <w:t xml:space="preserve">. Запись в </w:t>
+        <w:t xml:space="preserve"> Запись в </w:t>
       </w:r>
       <w:r>
         <w:t>LocalStorage</w:t>
@@ -1667,28 +1022,7 @@
         <w:rPr>
           <w:i/>
         </w:rPr>
-        <w:t xml:space="preserve"> не удалась (хранилище переполнено или запрещено, шаг 10): метод </w:t>
-      </w:r>
-      <w:r>
-        <w:t>storage.set</w:t>
-      </w:r>
-      <w:r>
-        <w:rPr>
-          <w:i/>
-        </w:rPr>
-        <w:t xml:space="preserve"> возвращает false, но система всё равно открывает страницу благодарности; </w:t>
-      </w:r>
-      <w:r>
-        <w:rPr>
-          <w:i/>
-        </w:rPr>
-        <w:t>сообщения об ошибке нет</w:t>
-      </w:r>
-      <w:r>
-        <w:rPr>
-          <w:i/>
-        </w:rPr>
-        <w:t xml:space="preserve">, </w:t>
+        <w:t xml:space="preserve"> не удалась: страница благодарности всё равно открывается, </w:t>
       </w:r>
       <w:r>
         <w:rPr>
@@ -1697,40 +1031,7 @@
         <w:t>заявка потеряна</w:t>
       </w:r>
       <w:r>
-        <w:t>* (дефект D-2);</w:t>
-      </w:r>
-    </w:p>
-    <w:p>
-      <w:pPr>
-        <w:ind w:firstLine="709"/>
-        <w:jc w:val="both"/>
-      </w:pPr>
-      <w:r>
-        <w:t>– *</w:t>
-      </w:r>
-      <w:r>
-        <w:rPr>
-          <w:i/>
-        </w:rPr>
-        <w:t>E2</w:t>
-      </w:r>
-      <w:r>
-        <w:rPr>
-          <w:i/>
-        </w:rPr>
-        <w:t xml:space="preserve">. </w:t>
-      </w:r>
-      <w:r>
-        <w:t>LocalStorage</w:t>
-      </w:r>
-      <w:r>
-        <w:rPr>
-          <w:i/>
-        </w:rPr>
-        <w:t xml:space="preserve"> недоступен совсем (</w:t>
-      </w:r>
-      <w:r>
-        <w:t>getStorage* использует временное хранилище в памяти): заявка живёт только до закрытия страницы, посетитель видит страницу благодарности.</w:t>
+        <w:t>*, ошибки нет (дефект D-2).</w:t>
       </w:r>
     </w:p>
     <w:p>
@@ -1745,7 +1046,61 @@
         <w:rPr>
           <w:i/>
         </w:rPr>
-        <w:t>Связанные требования.</w:t>
+        <w:t>Другие точки входа.</w:t>
+      </w:r>
+      <w:r>
+        <w:t>*</w:t>
+      </w:r>
+    </w:p>
+    <w:p>
+      <w:pPr>
+        <w:ind w:firstLine="709"/>
+        <w:jc w:val="both"/>
+      </w:pPr>
+      <w:r>
+        <w:t xml:space="preserve">– Ссылки «Записаться в бету: UML / BPMN / …» в разделе нотаций, кнопка «В бету» на </w:t>
+      </w:r>
+      <w:r>
+        <w:rPr>
+          <w:i/>
+        </w:rPr>
+        <w:t>privacy.html</w:t>
+      </w:r>
+      <w:r>
+        <w:t xml:space="preserve"> и </w:t>
+      </w:r>
+      <w:r>
+        <w:rPr>
+          <w:i/>
+        </w:rPr>
+        <w:t>thanks.html</w:t>
+      </w:r>
+      <w:r>
+        <w:t xml:space="preserve">, адрес </w:t>
+      </w:r>
+      <w:r>
+        <w:rPr>
+          <w:i/>
+        </w:rPr>
+        <w:t>/en/#waitlist</w:t>
+      </w:r>
+      <w:r>
+        <w:t>.</w:t>
+      </w:r>
+    </w:p>
+    <w:p>
+      <w:pPr>
+        <w:ind w:firstLine="709"/>
+        <w:jc w:val="both"/>
+      </w:pPr>
+      <w:r>
+        <w:t>*</w:t>
+      </w:r>
+      <w:r>
+        <w:rPr>
+          <w:i/>
+        </w:rPr>
+        <w:t>Связанные задачи.</w:t>
       </w:r>
       <w:r>
         <w:t>*</w:t>
@@ -1781,25 +1136,10 @@
         <w:rPr>
           <w:i/>
         </w:rPr>
-        <w:t>R1</w:t>
+        <w:t>UC-00</w:t>
       </w:r>
       <w:r>
-        <w:rPr>
-          <w:i/>
-        </w:rPr>
-        <w:t xml:space="preserve"> — Доступность страниц (главная, </w:t>
-      </w:r>
-      <w:r>
-        <w:t>thanks.html</w:t>
-      </w:r>
-      <w:r>
-        <w:rPr>
-          <w:i/>
-        </w:rPr>
-        <w:t xml:space="preserve">, </w:t>
-      </w:r>
-      <w:r>
-        <w:t>privacy.html*);</w:t>
+        <w:t>* — Прочитать политику конфиденциальности;</w:t>
       </w:r>
     </w:p>
     <w:p>
@@ -1814,10 +1154,10 @@
         <w:rPr>
           <w:i/>
         </w:rPr>
-        <w:t>R6</w:t>
+        <w:t>UC-03</w:t>
       </w:r>
       <w:r>
-        <w:t>* — Разметка и локализация (русская и английская версии);</w:t>
+        <w:t>* — Авторизация (в текущей версии не реализована);</w:t>
       </w:r>
     </w:p>
     <w:p>
@@ -1832,10 +1172,46 @@
         <w:rPr>
           <w:i/>
         </w:rPr>
-        <w:t>R9</w:t>
+        <w:t>UC-04</w:t>
       </w:r>
       <w:r>
-        <w:t>* — Локальное хранилище.</w:t>
+        <w:t>* — Запись в бету из React-приложения;</w:t>
+      </w:r>
+    </w:p>
+    <w:p>
+      <w:pPr>
+        <w:ind w:firstLine="709"/>
+        <w:jc w:val="both"/>
+      </w:pPr>
+      <w:r>
+        <w:t>– *</w:t>
+      </w:r>
+      <w:r>
+        <w:rPr>
+          <w:i/>
+        </w:rPr>
+        <w:t>TC-WL-001…022</w:t>
+      </w:r>
+      <w:r>
+        <w:t>* — Тест-кейсы формы (лаб. 2);</w:t>
+      </w:r>
+    </w:p>
+    <w:p>
+      <w:pPr>
+        <w:ind w:firstLine="709"/>
+        <w:jc w:val="both"/>
+      </w:pPr>
+      <w:r>
+        <w:t>– *</w:t>
+      </w:r>
+      <w:r>
+        <w:rPr>
+          <w:i/>
+        </w:rPr>
+        <w:t>SM-07, CP-35, CP-36</w:t>
+      </w:r>
+      <w:r>
+        <w:t>* — Проверки чек-листов (лаб. 3).</w:t>
       </w:r>
     </w:p>
     <w:p>
@@ -1850,7 +1226,7 @@
         <w:rPr>
           <w:i/>
         </w:rPr>
-        <w:t>Подзадачи.</w:t>
+        <w:t>Скриншоты.</w:t>
       </w:r>
       <w:r>
         <w:t>*</w:t>
@@ -1868,10 +1244,10 @@
         <w:rPr>
           <w:i/>
         </w:rPr>
-        <w:t>UC-01.1</w:t>
+        <w:t>SCR-01</w:t>
       </w:r>
       <w:r>
-        <w:t>* — Показ формы и подсказок к полям;</w:t>
+        <w:t>* — Форма: ошибки при пустой отправке;</w:t>
       </w:r>
     </w:p>
     <w:p>
@@ -1886,10 +1262,10 @@
         <w:rPr>
           <w:i/>
         </w:rPr>
-        <w:t>UC-01.2</w:t>
+        <w:t>SCR-02</w:t>
       </w:r>
       <w:r>
-        <w:t>* — Чтение, очистка и проверка значений по П1–П6;</w:t>
+        <w:t>* — Форма: заполнена;</w:t>
       </w:r>
     </w:p>
     <w:p>
@@ -1904,229 +1280,10 @@
         <w:rPr>
           <w:i/>
         </w:rPr>
-        <w:t>UC-01.3</w:t>
+        <w:t>SCR-03</w:t>
       </w:r>
       <w:r>
-        <w:t>* — Показ ошибок, фокус и повторная проверка;</w:t>
-      </w:r>
-    </w:p>
-    <w:p>
-      <w:pPr>
-        <w:ind w:firstLine="709"/>
-        <w:jc w:val="both"/>
-      </w:pPr>
-      <w:r>
-        <w:t>– *</w:t>
-      </w:r>
-      <w:r>
-        <w:rPr>
-          <w:i/>
-        </w:rPr>
-        <w:t>UC-01.4</w:t>
-      </w:r>
-      <w:r>
-        <w:rPr>
-          <w:i/>
-        </w:rPr>
-        <w:t xml:space="preserve"> — Сохранение заявки в </w:t>
-      </w:r>
-      <w:r>
-        <w:t>LocalStorage*;</w:t>
-      </w:r>
-    </w:p>
-    <w:p>
-      <w:pPr>
-        <w:ind w:firstLine="709"/>
-        <w:jc w:val="both"/>
-      </w:pPr>
-      <w:r>
-        <w:t>– *</w:t>
-      </w:r>
-      <w:r>
-        <w:rPr>
-          <w:i/>
-        </w:rPr>
-        <w:t>UC-01.5</w:t>
-      </w:r>
-      <w:r>
-        <w:t>* — Переход на страницу благодарности.</w:t>
-      </w:r>
-    </w:p>
-    <w:p>
-      <w:pPr>
-        <w:ind w:firstLine="709"/>
-        <w:jc w:val="both"/>
-      </w:pPr>
-      <w:r>
-        <w:t>*</w:t>
-      </w:r>
-      <w:r>
-        <w:rPr>
-          <w:i/>
-        </w:rPr>
-        <w:t>Связанные задачи и use case.</w:t>
-      </w:r>
-      <w:r>
-        <w:t>*</w:t>
-      </w:r>
-    </w:p>
-    <w:p>
-      <w:pPr>
-        <w:ind w:firstLine="709"/>
-        <w:jc w:val="both"/>
-      </w:pPr>
-      <w:r>
-        <w:t>– *</w:t>
-      </w:r>
-      <w:r>
-        <w:rPr>
-          <w:i/>
-        </w:rPr>
-        <w:t>UC-00</w:t>
-      </w:r>
-      <w:r>
-        <w:rPr>
-          <w:i/>
-        </w:rPr>
-        <w:t xml:space="preserve"> — Прочитать политику конфиденциальности (ссылка в тексте согласия, </w:t>
-      </w:r>
-      <w:r>
-        <w:t>privacy.html*);</w:t>
-      </w:r>
-    </w:p>
-    <w:p>
-      <w:pPr>
-        <w:ind w:firstLine="709"/>
-        <w:jc w:val="both"/>
-      </w:pPr>
-      <w:r>
-        <w:t>– *</w:t>
-      </w:r>
-      <w:r>
-        <w:rPr>
-          <w:i/>
-        </w:rPr>
-        <w:t>UC-02</w:t>
-      </w:r>
-      <w:r>
-        <w:rPr>
-          <w:i/>
-        </w:rPr>
-        <w:t xml:space="preserve"> — Выбрать нотацию на карточке и перейти к записи (ссылки </w:t>
-      </w:r>
-      <w:r>
-        <w:rPr>
-          <w:i/>
-        </w:rPr>
-        <w:t>«Записаться в бету: UML»</w:t>
-      </w:r>
-      <w:r>
-        <w:rPr>
-          <w:i/>
-        </w:rPr>
-        <w:t xml:space="preserve">, </w:t>
-      </w:r>
-      <w:r>
-        <w:rPr>
-          <w:i/>
-        </w:rPr>
-        <w:t>«…: BPMN»</w:t>
-      </w:r>
-      <w:r>
-        <w:t>*);</w:t>
-      </w:r>
-    </w:p>
-    <w:p>
-      <w:pPr>
-        <w:ind w:firstLine="709"/>
-        <w:jc w:val="both"/>
-      </w:pPr>
-      <w:r>
-        <w:t>– *</w:t>
-      </w:r>
-      <w:r>
-        <w:rPr>
-          <w:i/>
-        </w:rPr>
-        <w:t>UC-03</w:t>
-      </w:r>
-      <w:r>
-        <w:rPr>
-          <w:i/>
-        </w:rPr>
-        <w:t xml:space="preserve"> — Авторизация и вход в приложение: в текущей версии </w:t>
-      </w:r>
-      <w:r>
-        <w:t>не реализована</w:t>
-      </w:r>
-      <w:r>
-        <w:rPr>
-          <w:i/>
-        </w:rPr>
-        <w:t>, форма и приложение (</w:t>
-      </w:r>
-      <w:r>
-        <w:t>site/app/*) работают без входа; задача на будущее, после появления серверной части;</w:t>
-      </w:r>
-    </w:p>
-    <w:p>
-      <w:pPr>
-        <w:ind w:firstLine="709"/>
-        <w:jc w:val="both"/>
-      </w:pPr>
-      <w:r>
-        <w:t>– *</w:t>
-      </w:r>
-      <w:r>
-        <w:rPr>
-          <w:i/>
-        </w:rPr>
-        <w:t>UC-04</w:t>
-      </w:r>
-      <w:r>
-        <w:rPr>
-          <w:i/>
-        </w:rPr>
-        <w:t xml:space="preserve"> — Запись в бету из React-приложения (</w:t>
-      </w:r>
-      <w:r>
-        <w:t>react-app/src/App.jsx*, лаб. 7);</w:t>
-      </w:r>
-    </w:p>
-    <w:p>
-      <w:pPr>
-        <w:ind w:firstLine="709"/>
-        <w:jc w:val="both"/>
-      </w:pPr>
-      <w:r>
-        <w:t>– *</w:t>
-      </w:r>
-      <w:r>
-        <w:rPr>
-          <w:i/>
-        </w:rPr>
-        <w:t>D-1</w:t>
-      </w:r>
-      <w:r>
-        <w:t>* — Повторные заявки принимаются;</w:t>
-      </w:r>
-    </w:p>
-    <w:p>
-      <w:pPr>
-        <w:ind w:firstLine="709"/>
-        <w:jc w:val="both"/>
-      </w:pPr>
-      <w:r>
-        <w:t>– *</w:t>
-      </w:r>
-      <w:r>
-        <w:rPr>
-          <w:i/>
-        </w:rPr>
-        <w:t>D-2</w:t>
-      </w:r>
-      <w:r>
-        <w:t>* — Потеря заявки при сбое хранилища.</w:t>
+        <w:t>* — Страница благодарности.</w:t>
       </w:r>
     </w:p>
     <w:p>
@@ -2153,529 +1310,61 @@
         <w:jc w:val="both"/>
       </w:pPr>
       <w:r>
-        <w:t>– *</w:t>
+        <w:t xml:space="preserve">– </w:t>
       </w:r>
       <w:r>
         <w:rPr>
           <w:i/>
         </w:rPr>
-        <w:t>IMPL-01</w:t>
+        <w:t>site/index.html</w:t>
+      </w:r>
+      <w:r>
+        <w:t xml:space="preserve"> (форма </w:t>
       </w:r>
       <w:r>
         <w:rPr>
           <w:i/>
         </w:rPr>
-        <w:t xml:space="preserve"> — </w:t>
+        <w:t>#waitlist-form</w:t>
       </w:r>
       <w:r>
-        <w:t>site/index.html</w:t>
+        <w:t xml:space="preserve">), </w:t>
       </w:r>
       <w:r>
         <w:rPr>
           <w:i/>
         </w:rPr>
-        <w:t xml:space="preserve">: разметка формы </w:t>
+        <w:t>site/js/components/waitlist-form.js</w:t>
       </w:r>
       <w:r>
-        <w:t>#waitlist-form*;</w:t>
-      </w:r>
-    </w:p>
-    <w:p>
-      <w:pPr>
-        <w:ind w:firstLine="709"/>
-        <w:jc w:val="both"/>
-      </w:pPr>
-      <w:r>
-        <w:t>– *</w:t>
+        <w:t xml:space="preserve">, </w:t>
       </w:r>
       <w:r>
         <w:rPr>
           <w:i/>
         </w:rPr>
-        <w:t>IMPL-02</w:t>
+        <w:t>site/js/utils/validation.js</w:t>
+      </w:r>
+      <w:r>
+        <w:t xml:space="preserve">, </w:t>
       </w:r>
       <w:r>
         <w:rPr>
           <w:i/>
         </w:rPr>
-        <w:t xml:space="preserve"> — </w:t>
+        <w:t>site/js/utils/storage.js</w:t>
       </w:r>
       <w:r>
-        <w:t>site/js/components/waitlist-form.js</w:t>
+        <w:t xml:space="preserve">, </w:t>
       </w:r>
       <w:r>
         <w:rPr>
           <w:i/>
         </w:rPr>
-        <w:t xml:space="preserve">: </w:t>
-      </w:r>
-      <w:r>
-        <w:t>initWaitlistForm*, показ ошибок, отправка;</w:t>
-      </w:r>
-    </w:p>
-    <w:p>
-      <w:pPr>
-        <w:ind w:firstLine="709"/>
-        <w:jc w:val="both"/>
-      </w:pPr>
-      <w:r>
-        <w:t>– *</w:t>
-      </w:r>
-      <w:r>
-        <w:rPr>
-          <w:i/>
-        </w:rPr>
-        <w:t>IMPL-03</w:t>
-      </w:r>
-      <w:r>
-        <w:rPr>
-          <w:i/>
-        </w:rPr>
-        <w:t xml:space="preserve"> — </w:t>
-      </w:r>
-      <w:r>
-        <w:t>site/js/utils/validation.js</w:t>
-      </w:r>
-      <w:r>
-        <w:rPr>
-          <w:i/>
-        </w:rPr>
-        <w:t xml:space="preserve">: </w:t>
-      </w:r>
-      <w:r>
-        <w:t>validateWaitlist* и правила П1–П6;</w:t>
-      </w:r>
-    </w:p>
-    <w:p>
-      <w:pPr>
-        <w:ind w:firstLine="709"/>
-        <w:jc w:val="both"/>
-      </w:pPr>
-      <w:r>
-        <w:t>– *</w:t>
-      </w:r>
-      <w:r>
-        <w:rPr>
-          <w:i/>
-        </w:rPr>
-        <w:t>IMPL-04</w:t>
-      </w:r>
-      <w:r>
-        <w:rPr>
-          <w:i/>
-        </w:rPr>
-        <w:t xml:space="preserve"> — </w:t>
-      </w:r>
-      <w:r>
-        <w:t>site/js/utils/storage.js</w:t>
-      </w:r>
-      <w:r>
-        <w:rPr>
-          <w:i/>
-        </w:rPr>
-        <w:t xml:space="preserve">: createStorage, </w:t>
-      </w:r>
-      <w:r>
-        <w:t>getStorage*;</w:t>
-      </w:r>
-    </w:p>
-    <w:p>
-      <w:pPr>
-        <w:ind w:firstLine="709"/>
-        <w:jc w:val="both"/>
-      </w:pPr>
-      <w:r>
-        <w:t>– *</w:t>
-      </w:r>
-      <w:r>
-        <w:rPr>
-          <w:i/>
-        </w:rPr>
-        <w:t>IMPL-05</w:t>
-      </w:r>
-      <w:r>
-        <w:rPr>
-          <w:i/>
-        </w:rPr>
-        <w:t xml:space="preserve"> — </w:t>
-      </w:r>
-      <w:r>
         <w:t>site/thanks.html</w:t>
       </w:r>
       <w:r>
-        <w:rPr>
-          <w:i/>
-        </w:rPr>
-        <w:t xml:space="preserve"> и </w:t>
-      </w:r>
-      <w:r>
-        <w:t>site/en/thanks.html*: страница благодарности.</w:t>
-      </w:r>
-    </w:p>
-    <w:p>
-      <w:pPr>
-        <w:ind w:firstLine="709"/>
-        <w:jc w:val="both"/>
-      </w:pPr>
-      <w:r>
-        <w:t>*</w:t>
-      </w:r>
-      <w:r>
-        <w:rPr>
-          <w:i/>
-        </w:rPr>
-        <w:t>Тест-кейсы и проверки.</w:t>
-      </w:r>
-      <w:r>
-        <w:t>*</w:t>
-      </w:r>
-    </w:p>
-    <w:p>
-      <w:pPr>
-        <w:ind w:firstLine="709"/>
-        <w:jc w:val="both"/>
-      </w:pPr>
-      <w:r>
-        <w:t>– *</w:t>
-      </w:r>
-      <w:r>
-        <w:rPr>
-          <w:i/>
-        </w:rPr>
-        <w:t>TC-WL-001</w:t>
-      </w:r>
-      <w:r>
-        <w:t>* — Все поля корректны;</w:t>
-      </w:r>
-    </w:p>
-    <w:p>
-      <w:pPr>
-        <w:ind w:firstLine="709"/>
-        <w:jc w:val="both"/>
-      </w:pPr>
-      <w:r>
-        <w:t>– *</w:t>
-      </w:r>
-      <w:r>
-        <w:rPr>
-          <w:i/>
-        </w:rPr>
-        <w:t>TC-WL-002…007</w:t>
-      </w:r>
-      <w:r>
-        <w:t>* — Имя: границы и недопустимые символы (П1);</w:t>
-      </w:r>
-    </w:p>
-    <w:p>
-      <w:pPr>
-        <w:ind w:firstLine="709"/>
-        <w:jc w:val="both"/>
-      </w:pPr>
-      <w:r>
-        <w:t>– *</w:t>
-      </w:r>
-      <w:r>
-        <w:rPr>
-          <w:i/>
-        </w:rPr>
-        <w:t>TC-WL-008…011</w:t>
-      </w:r>
-      <w:r>
-        <w:t>* — Почта: формат и длина (П2);</w:t>
-      </w:r>
-    </w:p>
-    <w:p>
-      <w:pPr>
-        <w:ind w:firstLine="709"/>
-        <w:jc w:val="both"/>
-      </w:pPr>
-      <w:r>
-        <w:t>– *</w:t>
-      </w:r>
-      <w:r>
-        <w:rPr>
-          <w:i/>
-        </w:rPr>
-        <w:t>TC-WL-012…017</w:t>
-      </w:r>
-      <w:r>
-        <w:t>* — Размер команды: границы и тип (П4);</w:t>
-      </w:r>
-    </w:p>
-    <w:p>
-      <w:pPr>
-        <w:ind w:firstLine="709"/>
-        <w:jc w:val="both"/>
-      </w:pPr>
-      <w:r>
-        <w:t>– *</w:t>
-      </w:r>
-      <w:r>
-        <w:rPr>
-          <w:i/>
-        </w:rPr>
-        <w:t>TC-WL-018</w:t>
-      </w:r>
-      <w:r>
-        <w:t>* — Нотация вне списка (П3);</w:t>
-      </w:r>
-    </w:p>
-    <w:p>
-      <w:pPr>
-        <w:ind w:firstLine="709"/>
-        <w:jc w:val="both"/>
-      </w:pPr>
-      <w:r>
-        <w:t>– *</w:t>
-      </w:r>
-      <w:r>
-        <w:rPr>
-          <w:i/>
-        </w:rPr>
-        <w:t>TC-WL-019, 020</w:t>
-      </w:r>
-      <w:r>
-        <w:t>* — Комментарий: граница 500 (П5);</w:t>
-      </w:r>
-    </w:p>
-    <w:p>
-      <w:pPr>
-        <w:ind w:firstLine="709"/>
-        <w:jc w:val="both"/>
-      </w:pPr>
-      <w:r>
-        <w:t>– *</w:t>
-      </w:r>
-      <w:r>
-        <w:rPr>
-          <w:i/>
-        </w:rPr>
-        <w:t>TC-WL-021</w:t>
-      </w:r>
-      <w:r>
-        <w:t>* — Согласие не дано (П6);</w:t>
-      </w:r>
-    </w:p>
-    <w:p>
-      <w:pPr>
-        <w:ind w:firstLine="709"/>
-        <w:jc w:val="both"/>
-      </w:pPr>
-      <w:r>
-        <w:t>– *</w:t>
-      </w:r>
-      <w:r>
-        <w:rPr>
-          <w:i/>
-        </w:rPr>
-        <w:t>TC-WL-022</w:t>
-      </w:r>
-      <w:r>
-        <w:t>* — Пустая форма (A1);</w:t>
-      </w:r>
-    </w:p>
-    <w:p>
-      <w:pPr>
-        <w:ind w:firstLine="709"/>
-        <w:jc w:val="both"/>
-      </w:pPr>
-      <w:r>
-        <w:t>– *</w:t>
-      </w:r>
-      <w:r>
-        <w:rPr>
-          <w:i/>
-        </w:rPr>
-        <w:t>SM-07</w:t>
-      </w:r>
-      <w:r>
-        <w:t>* — Форма заявки есть на главной;</w:t>
-      </w:r>
-    </w:p>
-    <w:p>
-      <w:pPr>
-        <w:ind w:firstLine="709"/>
-        <w:jc w:val="both"/>
-      </w:pPr>
-      <w:r>
-        <w:t>– *</w:t>
-      </w:r>
-      <w:r>
-        <w:rPr>
-          <w:i/>
-        </w:rPr>
-        <w:t>CP-35</w:t>
-      </w:r>
-      <w:r>
-        <w:t>* — Валидация корректной заявки;</w:t>
-      </w:r>
-    </w:p>
-    <w:p>
-      <w:pPr>
-        <w:ind w:firstLine="709"/>
-        <w:jc w:val="both"/>
-      </w:pPr>
-      <w:r>
-        <w:t>– *</w:t>
-      </w:r>
-      <w:r>
-        <w:rPr>
-          <w:i/>
-        </w:rPr>
-        <w:t>CP-36</w:t>
-      </w:r>
-      <w:r>
-        <w:t>* — У полей есть подписи и сообщения об ошибках.</w:t>
-      </w:r>
-    </w:p>
-    <w:p>
-      <w:pPr>
-        <w:ind w:firstLine="709"/>
-        <w:jc w:val="both"/>
-      </w:pPr>
-      <w:r>
-        <w:t>*</w:t>
-      </w:r>
-      <w:r>
-        <w:rPr>
-          <w:i/>
-        </w:rPr>
-        <w:t>Скриншоты интерфейса.</w:t>
-      </w:r>
-      <w:r>
-        <w:t>*</w:t>
-      </w:r>
-    </w:p>
-    <w:p>
-      <w:pPr>
-        <w:ind w:firstLine="709"/>
-        <w:jc w:val="both"/>
-      </w:pPr>
-      <w:r>
-        <w:t>– *</w:t>
-      </w:r>
-      <w:r>
-        <w:rPr>
-          <w:i/>
-        </w:rPr>
-        <w:t>SCR-01</w:t>
-      </w:r>
-      <w:r>
-        <w:t>* — Главная страница, русская версия (01-home.png);</w:t>
-      </w:r>
-    </w:p>
-    <w:p>
-      <w:pPr>
-        <w:ind w:firstLine="709"/>
-        <w:jc w:val="both"/>
-      </w:pPr>
-      <w:r>
-        <w:t>– *</w:t>
-      </w:r>
-      <w:r>
-        <w:rPr>
-          <w:i/>
-        </w:rPr>
-        <w:t>SCR-02</w:t>
-      </w:r>
-      <w:r>
-        <w:t>* — Главная страница, английская версия (02-home-en.png);</w:t>
-      </w:r>
-    </w:p>
-    <w:p>
-      <w:pPr>
-        <w:ind w:firstLine="709"/>
-        <w:jc w:val="both"/>
-      </w:pPr>
-      <w:r>
-        <w:t>– *</w:t>
-      </w:r>
-      <w:r>
-        <w:rPr>
-          <w:i/>
-        </w:rPr>
-        <w:t>SCR-03</w:t>
-      </w:r>
-      <w:r>
-        <w:t>* — Форма заявки: ошибки при пустой отправке (03-form-errors.png);</w:t>
-      </w:r>
-    </w:p>
-    <w:p>
-      <w:pPr>
-        <w:ind w:firstLine="709"/>
-        <w:jc w:val="both"/>
-      </w:pPr>
-      <w:r>
-        <w:t>– *</w:t>
-      </w:r>
-      <w:r>
-        <w:rPr>
-          <w:i/>
-        </w:rPr>
-        <w:t>SCR-04</w:t>
-      </w:r>
-      <w:r>
-        <w:t>* — Форма заявки: заполнена корректными данными (04-form-filled.png);</w:t>
-      </w:r>
-    </w:p>
-    <w:p>
-      <w:pPr>
-        <w:ind w:firstLine="709"/>
-        <w:jc w:val="both"/>
-      </w:pPr>
-      <w:r>
-        <w:t>– *</w:t>
-      </w:r>
-      <w:r>
-        <w:rPr>
-          <w:i/>
-        </w:rPr>
-        <w:t>SCR-05</w:t>
-      </w:r>
-      <w:r>
-        <w:t>* — Страница благодарности (05-form-submitted.png);</w:t>
-      </w:r>
-    </w:p>
-    <w:p>
-      <w:pPr>
-        <w:ind w:firstLine="709"/>
-        <w:jc w:val="both"/>
-      </w:pPr>
-      <w:r>
-        <w:t>– *</w:t>
-      </w:r>
-      <w:r>
-        <w:rPr>
-          <w:i/>
-        </w:rPr>
-        <w:t>SCR-06</w:t>
-      </w:r>
-      <w:r>
-        <w:rPr>
-          <w:i/>
-        </w:rPr>
-        <w:t xml:space="preserve"> — Запись заявки в </w:t>
-      </w:r>
-      <w:r>
-        <w:t>LocalStorage* (12-uc-storage-record.png);</w:t>
-      </w:r>
-    </w:p>
-    <w:p>
-      <w:pPr>
-        <w:ind w:firstLine="709"/>
-        <w:jc w:val="both"/>
-      </w:pPr>
-      <w:r>
-        <w:t>– *</w:t>
-      </w:r>
-      <w:r>
-        <w:rPr>
-          <w:i/>
-        </w:rPr>
-        <w:t>SCR-07</w:t>
-      </w:r>
-      <w:r>
-        <w:t>* — Сбой записи: страница благодарности без ошибки (13-uc-storage-failure.png).</w:t>
+        <w:t>.</w:t>
       </w:r>
     </w:p>
     <w:p>
@@ -2702,16 +1391,7 @@
         <w:jc w:val="both"/>
       </w:pPr>
       <w:r>
-        <w:t>*</w:t>
-      </w:r>
-      <w:r>
-        <w:rPr>
-          <w:i/>
-        </w:rPr>
-        <w:t>Страницы проекта (при запущенном npm start):</w:t>
-      </w:r>
-      <w:r>
-        <w:t>*</w:t>
+        <w:t>– http://localhost:5173/#waitlist;</w:t>
       </w:r>
     </w:p>
     <w:p>
@@ -2720,7 +1400,7 @@
         <w:jc w:val="both"/>
       </w:pPr>
       <w:r>
-        <w:t>– http://localhost:5173/ — главная страница (русская версия);</w:t>
+        <w:t>– http://localhost:5173/thanks.html;</w:t>
       </w:r>
     </w:p>
     <w:p>
@@ -2729,88 +1409,7 @@
         <w:jc w:val="both"/>
       </w:pPr>
       <w:r>
-        <w:t>– http://localhost:5173/#waitlist — раздел «Записаться в бету»;</w:t>
-      </w:r>
-    </w:p>
-    <w:p>
-      <w:pPr>
-        <w:ind w:firstLine="709"/>
-        <w:jc w:val="both"/>
-      </w:pPr>
-      <w:r>
-        <w:t>– http://localhost:5173/thanks.html — страница благодарности;</w:t>
-      </w:r>
-    </w:p>
-    <w:p>
-      <w:pPr>
-        <w:ind w:firstLine="709"/>
-        <w:jc w:val="both"/>
-      </w:pPr>
-      <w:r>
-        <w:t>– http://localhost:5173/privacy.html — политика конфиденциальности;</w:t>
-      </w:r>
-    </w:p>
-    <w:p>
-      <w:pPr>
-        <w:ind w:firstLine="709"/>
-        <w:jc w:val="both"/>
-      </w:pPr>
-      <w:r>
-        <w:t>– http://localhost:5173/en/ — главная страница (английская версия);</w:t>
-      </w:r>
-    </w:p>
-    <w:p>
-      <w:pPr>
-        <w:ind w:firstLine="709"/>
-        <w:jc w:val="both"/>
-      </w:pPr>
-      <w:r>
-        <w:t>– http://localhost:5173/en/thanks.html — страница благодарности (английская версия).</w:t>
-      </w:r>
-    </w:p>
-    <w:p>
-      <w:pPr>
-        <w:ind w:firstLine="709"/>
-        <w:jc w:val="both"/>
-      </w:pPr>
-      <w:r>
-        <w:t>*</w:t>
-      </w:r>
-      <w:r>
-        <w:rPr>
-          <w:i/>
-        </w:rPr>
-        <w:t>Репозиторий и источники:</w:t>
-      </w:r>
-      <w:r>
-        <w:t>*</w:t>
-      </w:r>
-    </w:p>
-    <w:p>
-      <w:pPr>
-        <w:ind w:firstLine="709"/>
-        <w:jc w:val="both"/>
-      </w:pPr>
-      <w:r>
-        <w:t>– https://github.com/KsushaKhadzhinova/DSLKit-Project — репозиторий проекта;</w:t>
-      </w:r>
-    </w:p>
-    <w:p>
-      <w:pPr>
-        <w:ind w:firstLine="709"/>
-        <w:jc w:val="both"/>
-      </w:pPr>
-      <w:r>
-        <w:t>– https://svyatoslav.biz/software_testing_book/ — книга «Тестирование программного обеспечения. Базовый курс»;</w:t>
-      </w:r>
-    </w:p>
-    <w:p>
-      <w:pPr>
-        <w:ind w:firstLine="709"/>
-        <w:jc w:val="both"/>
-      </w:pPr>
-      <w:r>
-        <w:t>– https://github.com/KsushaKhadzhinova/report-gen — генератор отчётов.</w:t>
+        <w:t>– https://github.com/KsushaKhadzhinova/DSLKit-Project.</w:t>
       </w:r>
     </w:p>
     <w:p>
@@ -2878,7 +1477,7 @@
               <w:rPr>
                 <w:sz w:val="24"/>
               </w:rPr>
-              <w:t>Тип, длина</w:t>
+              <w:t>Тип</w:t>
             </w:r>
           </w:p>
         </w:tc>
@@ -2896,7 +1495,43 @@
               <w:rPr>
                 <w:sz w:val="24"/>
               </w:rPr>
-              <w:t>Обязат., уникальность</w:t>
+              <w:t>Длина</w:t>
+            </w:r>
+          </w:p>
+        </w:tc>
+        <w:tc>
+          <w:tcPr>
+            <w:tcW w:type="dxa" w:w="1336"/>
+          </w:tcPr>
+          <w:p>
+            <w:pPr>
+              <w:spacing w:line="240" w:lineRule="auto"/>
+              <w:jc w:val="center"/>
+            </w:pPr>
+            <w:r/>
+            <w:r>
+              <w:rPr>
+                <w:sz w:val="24"/>
+              </w:rPr>
+              <w:t>Обязат.</w:t>
+            </w:r>
+          </w:p>
+        </w:tc>
+        <w:tc>
+          <w:tcPr>
+            <w:tcW w:type="dxa" w:w="1336"/>
+          </w:tcPr>
+          <w:p>
+            <w:pPr>
+              <w:spacing w:line="240" w:lineRule="auto"/>
+              <w:jc w:val="center"/>
+            </w:pPr>
+            <w:r/>
+            <w:r>
+              <w:rPr>
+                <w:sz w:val="24"/>
+              </w:rPr>
+              <w:t>Уник.</w:t>
             </w:r>
           </w:p>
         </w:tc>
@@ -2932,43 +1567,7 @@
               <w:rPr>
                 <w:sz w:val="24"/>
               </w:rPr>
-              <w:t>По умолч.</w:t>
-            </w:r>
-          </w:p>
-        </w:tc>
-        <w:tc>
-          <w:tcPr>
-            <w:tcW w:type="dxa" w:w="1336"/>
-          </w:tcPr>
-          <w:p>
-            <w:pPr>
-              <w:spacing w:line="240" w:lineRule="auto"/>
-              <w:jc w:val="center"/>
-            </w:pPr>
-            <w:r/>
-            <w:r>
-              <w:rPr>
-                <w:sz w:val="24"/>
-              </w:rPr>
               <w:t>Связь</w:t>
-            </w:r>
-          </w:p>
-        </w:tc>
-        <w:tc>
-          <w:tcPr>
-            <w:tcW w:type="dxa" w:w="1336"/>
-          </w:tcPr>
-          <w:p>
-            <w:pPr>
-              <w:spacing w:line="240" w:lineRule="auto"/>
-              <w:jc w:val="center"/>
-            </w:pPr>
-            <w:r/>
-            <w:r>
-              <w:rPr>
-                <w:sz w:val="24"/>
-              </w:rPr>
-              <w:t>Прав.</w:t>
             </w:r>
           </w:p>
         </w:tc>
@@ -2988,7 +1587,7 @@
               <w:rPr>
                 <w:sz w:val="24"/>
               </w:rPr>
-              <w:t>name*</w:t>
+              <w:t>name\* (П1)</w:t>
             </w:r>
           </w:p>
         </w:tc>
@@ -3006,7 +1605,7 @@
               <w:rPr>
                 <w:sz w:val="24"/>
               </w:rPr>
-              <w:t>string, 2–60</w:t>
+              <w:t>string</w:t>
             </w:r>
           </w:p>
         </w:tc>
@@ -3024,7 +1623,7 @@
               <w:rPr>
                 <w:sz w:val="24"/>
               </w:rPr>
-              <w:t>Да; не уникально</w:t>
+              <w:t>2–60</w:t>
             </w:r>
           </w:p>
         </w:tc>
@@ -3042,7 +1641,43 @@
               <w:rPr>
                 <w:sz w:val="24"/>
               </w:rPr>
-              <w:t>буквы, пробел, апостроф, дефис; первая буква</w:t>
+              <w:t>Да</w:t>
+            </w:r>
+          </w:p>
+        </w:tc>
+        <w:tc>
+          <w:tcPr>
+            <w:tcW w:type="dxa" w:w="1336"/>
+          </w:tcPr>
+          <w:p>
+            <w:pPr>
+              <w:spacing w:line="240" w:lineRule="auto"/>
+              <w:jc w:val="left"/>
+            </w:pPr>
+            <w:r/>
+            <w:r>
+              <w:rPr>
+                <w:sz w:val="24"/>
+              </w:rPr>
+              <w:t>Нет</w:t>
+            </w:r>
+          </w:p>
+        </w:tc>
+        <w:tc>
+          <w:tcPr>
+            <w:tcW w:type="dxa" w:w="1336"/>
+          </w:tcPr>
+          <w:p>
+            <w:pPr>
+              <w:spacing w:line="240" w:lineRule="auto"/>
+              <w:jc w:val="left"/>
+            </w:pPr>
+            <w:r/>
+            <w:r>
+              <w:rPr>
+                <w:sz w:val="24"/>
+              </w:rPr>
+              <w:t>буквы, пробел, апостроф, дефис; первая — буква</w:t>
             </w:r>
           </w:p>
         </w:tc>
@@ -3064,6 +1699,8 @@
             </w:r>
           </w:p>
         </w:tc>
+      </w:tr>
+      <w:tr>
         <w:tc>
           <w:tcPr>
             <w:tcW w:type="dxa" w:w="1336"/>
@@ -3078,7 +1715,7 @@
               <w:rPr>
                 <w:sz w:val="24"/>
               </w:rPr>
-              <w:t>Связей нет</w:t>
+              <w:t>email\* (П2)</w:t>
             </w:r>
           </w:p>
         </w:tc>
@@ -3096,27 +1733,7 @@
               <w:rPr>
                 <w:sz w:val="24"/>
               </w:rPr>
-              <w:t>П1</w:t>
-            </w:r>
-          </w:p>
-        </w:tc>
-      </w:tr>
-      <w:tr>
-        <w:tc>
-          <w:tcPr>
-            <w:tcW w:type="dxa" w:w="1336"/>
-          </w:tcPr>
-          <w:p>
-            <w:pPr>
-              <w:spacing w:line="240" w:lineRule="auto"/>
-              <w:jc w:val="left"/>
-            </w:pPr>
-            <w:r/>
-            <w:r>
-              <w:rPr>
-                <w:sz w:val="24"/>
-              </w:rPr>
-              <w:t>email*</w:t>
+              <w:t>string</w:t>
             </w:r>
           </w:p>
         </w:tc>
@@ -3134,7 +1751,7 @@
               <w:rPr>
                 <w:sz w:val="24"/>
               </w:rPr>
-              <w:t>string, 6–120</w:t>
+              <w:t>6–120</w:t>
             </w:r>
           </w:p>
         </w:tc>
@@ -3152,7 +1769,25 @@
               <w:rPr>
                 <w:sz w:val="24"/>
               </w:rPr>
-              <w:t>Да; не уникально</w:t>
+              <w:t>Да</w:t>
+            </w:r>
+          </w:p>
+        </w:tc>
+        <w:tc>
+          <w:tcPr>
+            <w:tcW w:type="dxa" w:w="1336"/>
+          </w:tcPr>
+          <w:p>
+            <w:pPr>
+              <w:spacing w:line="240" w:lineRule="auto"/>
+              <w:jc w:val="left"/>
+            </w:pPr>
+            <w:r/>
+            <w:r>
+              <w:rPr>
+                <w:sz w:val="24"/>
+              </w:rPr>
+              <w:t>Нет (дубликаты принимаются, D-1)</w:t>
             </w:r>
           </w:p>
         </w:tc>
@@ -3192,6 +1827,8 @@
             </w:r>
           </w:p>
         </w:tc>
+      </w:tr>
+      <w:tr>
         <w:tc>
           <w:tcPr>
             <w:tcW w:type="dxa" w:w="1336"/>
@@ -3206,7 +1843,7 @@
               <w:rPr>
                 <w:sz w:val="24"/>
               </w:rPr>
-              <w:t>Адрес получателя приглашения</w:t>
+              <w:t>notation\* (П3)</w:t>
             </w:r>
           </w:p>
         </w:tc>
@@ -3224,7 +1861,97 @@
               <w:rPr>
                 <w:sz w:val="24"/>
               </w:rPr>
-              <w:t>П2</w:t>
+              <w:t>enum</w:t>
+            </w:r>
+          </w:p>
+        </w:tc>
+        <w:tc>
+          <w:tcPr>
+            <w:tcW w:type="dxa" w:w="1336"/>
+          </w:tcPr>
+          <w:p>
+            <w:pPr>
+              <w:spacing w:line="240" w:lineRule="auto"/>
+              <w:jc w:val="left"/>
+            </w:pPr>
+            <w:r/>
+            <w:r>
+              <w:rPr>
+                <w:sz w:val="24"/>
+              </w:rPr>
+              <w:t>3–5</w:t>
+            </w:r>
+          </w:p>
+        </w:tc>
+        <w:tc>
+          <w:tcPr>
+            <w:tcW w:type="dxa" w:w="1336"/>
+          </w:tcPr>
+          <w:p>
+            <w:pPr>
+              <w:spacing w:line="240" w:lineRule="auto"/>
+              <w:jc w:val="left"/>
+            </w:pPr>
+            <w:r/>
+            <w:r>
+              <w:rPr>
+                <w:sz w:val="24"/>
+              </w:rPr>
+              <w:t>Да</w:t>
+            </w:r>
+          </w:p>
+        </w:tc>
+        <w:tc>
+          <w:tcPr>
+            <w:tcW w:type="dxa" w:w="1336"/>
+          </w:tcPr>
+          <w:p>
+            <w:pPr>
+              <w:spacing w:line="240" w:lineRule="auto"/>
+              <w:jc w:val="left"/>
+            </w:pPr>
+            <w:r/>
+            <w:r>
+              <w:rPr>
+                <w:sz w:val="24"/>
+              </w:rPr>
+              <w:t>Нет</w:t>
+            </w:r>
+          </w:p>
+        </w:tc>
+        <w:tc>
+          <w:tcPr>
+            <w:tcW w:type="dxa" w:w="1336"/>
+          </w:tcPr>
+          <w:p>
+            <w:pPr>
+              <w:spacing w:line="240" w:lineRule="auto"/>
+              <w:jc w:val="left"/>
+            </w:pPr>
+            <w:r/>
+            <w:r>
+              <w:rPr>
+                <w:sz w:val="24"/>
+              </w:rPr>
+              <w:t>idef0, dfd, erd, bpmn, uml, petri</w:t>
+            </w:r>
+          </w:p>
+        </w:tc>
+        <w:tc>
+          <w:tcPr>
+            <w:tcW w:type="dxa" w:w="1336"/>
+          </w:tcPr>
+          <w:p>
+            <w:pPr>
+              <w:spacing w:line="240" w:lineRule="auto"/>
+              <w:jc w:val="left"/>
+            </w:pPr>
+            <w:r/>
+            <w:r>
+              <w:rPr>
+                <w:sz w:val="24"/>
+              </w:rPr>
+              <w:t>→ справочник Notation, N:1</w:t>
             </w:r>
           </w:p>
         </w:tc>
@@ -3244,7 +1971,7 @@
               <w:rPr>
                 <w:sz w:val="24"/>
               </w:rPr>
-              <w:t>notation*</w:t>
+              <w:t>team\* (П4)</w:t>
             </w:r>
           </w:p>
         </w:tc>
@@ -3262,7 +1989,7 @@
               <w:rPr>
                 <w:sz w:val="24"/>
               </w:rPr>
-              <w:t>enum, 3–5</w:t>
+              <w:t>integer</w:t>
             </w:r>
           </w:p>
         </w:tc>
@@ -3280,7 +2007,7 @@
               <w:rPr>
                 <w:sz w:val="24"/>
               </w:rPr>
-              <w:t>Да; не уникально</w:t>
+              <w:t>0–500</w:t>
             </w:r>
           </w:p>
         </w:tc>
@@ -3298,7 +2025,7 @@
               <w:rPr>
                 <w:sz w:val="24"/>
               </w:rPr>
-              <w:t>один из шести: idef0 … petri</w:t>
+              <w:t>Да</w:t>
             </w:r>
           </w:p>
         </w:tc>
@@ -3316,7 +2043,7 @@
               <w:rPr>
                 <w:sz w:val="24"/>
               </w:rPr>
-              <w:t>не выбрано</w:t>
+              <w:t>Нет</w:t>
             </w:r>
           </w:p>
         </w:tc>
@@ -3334,7 +2061,7 @@
               <w:rPr>
                 <w:sz w:val="24"/>
               </w:rPr>
-              <w:t>FK → Notation.id (N:1), справочник NOTATIONS в validation.js</w:t>
+              <w:t>целое число; по умолчанию 0</w:t>
             </w:r>
           </w:p>
         </w:tc>
@@ -3352,7 +2079,7 @@
               <w:rPr>
                 <w:sz w:val="24"/>
               </w:rPr>
-              <w:t>П3</w:t>
+              <w:t>—</w:t>
             </w:r>
           </w:p>
         </w:tc>
@@ -3372,7 +2099,7 @@
               <w:rPr>
                 <w:sz w:val="24"/>
               </w:rPr>
-              <w:t>team*</w:t>
+              <w:t>comment (П5)</w:t>
             </w:r>
           </w:p>
         </w:tc>
@@ -3390,7 +2117,7 @@
               <w:rPr>
                 <w:sz w:val="24"/>
               </w:rPr>
-              <w:t>integer, 0–500 (до 3 цифр)</w:t>
+              <w:t>string</w:t>
             </w:r>
           </w:p>
         </w:tc>
@@ -3408,7 +2135,7 @@
               <w:rPr>
                 <w:sz w:val="24"/>
               </w:rPr>
-              <w:t>Да; не уникально</w:t>
+              <w:t>0–500</w:t>
             </w:r>
           </w:p>
         </w:tc>
@@ -3426,7 +2153,7 @@
               <w:rPr>
                 <w:sz w:val="24"/>
               </w:rPr>
-              <w:t>целые цифры 0–500</w:t>
+              <w:t>Нет</w:t>
             </w:r>
           </w:p>
         </w:tc>
@@ -3444,99 +2171,7 @@
               <w:rPr>
                 <w:sz w:val="24"/>
               </w:rPr>
-              <w:t>0</w:t>
-            </w:r>
-          </w:p>
-        </w:tc>
-        <w:tc>
-          <w:tcPr>
-            <w:tcW w:type="dxa" w:w="1336"/>
-          </w:tcPr>
-          <w:p>
-            <w:pPr>
-              <w:spacing w:line="240" w:lineRule="auto"/>
-              <w:jc w:val="left"/>
-            </w:pPr>
-            <w:r/>
-            <w:r>
-              <w:rPr>
-                <w:sz w:val="24"/>
-              </w:rPr>
-              <w:t>Связей нет</w:t>
-            </w:r>
-          </w:p>
-        </w:tc>
-        <w:tc>
-          <w:tcPr>
-            <w:tcW w:type="dxa" w:w="1336"/>
-          </w:tcPr>
-          <w:p>
-            <w:pPr>
-              <w:spacing w:line="240" w:lineRule="auto"/>
-              <w:jc w:val="left"/>
-            </w:pPr>
-            <w:r/>
-            <w:r>
-              <w:rPr>
-                <w:sz w:val="24"/>
-              </w:rPr>
-              <w:t>П4</w:t>
-            </w:r>
-          </w:p>
-        </w:tc>
-      </w:tr>
-      <w:tr>
-        <w:tc>
-          <w:tcPr>
-            <w:tcW w:type="dxa" w:w="1336"/>
-          </w:tcPr>
-          <w:p>
-            <w:pPr>
-              <w:spacing w:line="240" w:lineRule="auto"/>
-              <w:jc w:val="left"/>
-            </w:pPr>
-            <w:r/>
-            <w:r>
-              <w:rPr>
-                <w:sz w:val="24"/>
-              </w:rPr>
-              <w:t>comment</w:t>
-            </w:r>
-          </w:p>
-        </w:tc>
-        <w:tc>
-          <w:tcPr>
-            <w:tcW w:type="dxa" w:w="1336"/>
-          </w:tcPr>
-          <w:p>
-            <w:pPr>
-              <w:spacing w:line="240" w:lineRule="auto"/>
-              <w:jc w:val="left"/>
-            </w:pPr>
-            <w:r/>
-            <w:r>
-              <w:rPr>
-                <w:sz w:val="24"/>
-              </w:rPr>
-              <w:t>string, 0–500</w:t>
-            </w:r>
-          </w:p>
-        </w:tc>
-        <w:tc>
-          <w:tcPr>
-            <w:tcW w:type="dxa" w:w="1336"/>
-          </w:tcPr>
-          <w:p>
-            <w:pPr>
-              <w:spacing w:line="240" w:lineRule="auto"/>
-              <w:jc w:val="left"/>
-            </w:pPr>
-            <w:r/>
-            <w:r>
-              <w:rPr>
-                <w:sz w:val="24"/>
-              </w:rPr>
-              <w:t>Нет; не уникально</w:t>
+              <w:t>Нет</w:t>
             </w:r>
           </w:p>
         </w:tc>
@@ -3572,43 +2207,7 @@
               <w:rPr>
                 <w:sz w:val="24"/>
               </w:rPr>
-              <w:t>пусто</w:t>
-            </w:r>
-          </w:p>
-        </w:tc>
-        <w:tc>
-          <w:tcPr>
-            <w:tcW w:type="dxa" w:w="1336"/>
-          </w:tcPr>
-          <w:p>
-            <w:pPr>
-              <w:spacing w:line="240" w:lineRule="auto"/>
-              <w:jc w:val="left"/>
-            </w:pPr>
-            <w:r/>
-            <w:r>
-              <w:rPr>
-                <w:sz w:val="24"/>
-              </w:rPr>
-              <w:t>Связей нет</w:t>
-            </w:r>
-          </w:p>
-        </w:tc>
-        <w:tc>
-          <w:tcPr>
-            <w:tcW w:type="dxa" w:w="1336"/>
-          </w:tcPr>
-          <w:p>
-            <w:pPr>
-              <w:spacing w:line="240" w:lineRule="auto"/>
-              <w:jc w:val="left"/>
-            </w:pPr>
-            <w:r/>
-            <w:r>
-              <w:rPr>
-                <w:sz w:val="24"/>
-              </w:rPr>
-              <w:t>П5</w:t>
+              <w:t>—</w:t>
             </w:r>
           </w:p>
         </w:tc>
@@ -3628,7 +2227,7 @@
               <w:rPr>
                 <w:sz w:val="24"/>
               </w:rPr>
-              <w:t>consent*</w:t>
+              <w:t>consent\* (П6)</w:t>
             </w:r>
           </w:p>
         </w:tc>
@@ -3646,7 +2245,7 @@
               <w:rPr>
                 <w:sz w:val="24"/>
               </w:rPr>
-              <w:t>boolean, —</w:t>
+              <w:t>boolean</w:t>
             </w:r>
           </w:p>
         </w:tc>
@@ -3664,7 +2263,7 @@
               <w:rPr>
                 <w:sz w:val="24"/>
               </w:rPr>
-              <w:t>Да, значение true; —</w:t>
+              <w:t>—</w:t>
             </w:r>
           </w:p>
         </w:tc>
@@ -3682,7 +2281,7 @@
               <w:rPr>
                 <w:sz w:val="24"/>
               </w:rPr>
-              <w:t>только true</w:t>
+              <w:t>Да, только true</w:t>
             </w:r>
           </w:p>
         </w:tc>
@@ -3700,7 +2299,7 @@
               <w:rPr>
                 <w:sz w:val="24"/>
               </w:rPr>
-              <w:t>false</w:t>
+              <w:t>—</w:t>
             </w:r>
           </w:p>
         </w:tc>
@@ -3718,7 +2317,7 @@
               <w:rPr>
                 <w:sz w:val="24"/>
               </w:rPr>
-              <w:t>→ документ «Политика конфиденциальности» (privacy.html)</w:t>
+              <w:t>флажок; в запись не сохраняется</w:t>
             </w:r>
           </w:p>
         </w:tc>
@@ -3736,7 +2335,7 @@
               <w:rPr>
                 <w:sz w:val="24"/>
               </w:rPr>
-              <w:t>П6</w:t>
+              <w:t>→ политика (privacy.html)</w:t>
             </w:r>
           </w:p>
         </w:tc>
@@ -3774,7 +2373,7 @@
               <w:rPr>
                 <w:sz w:val="24"/>
               </w:rPr>
-              <w:t>string, 24</w:t>
+              <w:t>string ISO 8601</w:t>
             </w:r>
           </w:p>
         </w:tc>
@@ -3792,7 +2391,7 @@
               <w:rPr>
                 <w:sz w:val="24"/>
               </w:rPr>
-              <w:t>Да; не уникально</w:t>
+              <w:t>24</w:t>
             </w:r>
           </w:p>
         </w:tc>
@@ -3810,7 +2409,7 @@
               <w:rPr>
                 <w:sz w:val="24"/>
               </w:rPr>
-              <w:t>ISO 8601, UTC</w:t>
+              <w:t>Да, ставит система</w:t>
             </w:r>
           </w:p>
         </w:tc>
@@ -3828,7 +2427,7 @@
               <w:rPr>
                 <w:sz w:val="24"/>
               </w:rPr>
-              <w:t>текущее время</w:t>
+              <w:t>Нет</w:t>
             </w:r>
           </w:p>
         </w:tc>
@@ -3846,7 +2445,7 @@
               <w:rPr>
                 <w:sz w:val="24"/>
               </w:rPr>
-              <w:t>Связей нет</w:t>
+              <w:t>ГГГГ-ММ-ДДTЧЧ:ММ:СС.сссZ</w:t>
             </w:r>
           </w:p>
         </w:tc>
@@ -3877,922 +2476,9 @@
         <w:jc w:val="both"/>
       </w:pPr>
       <w:r>
-        <w:t>Хранилище: массив JSON в LocalStorage, ключ dslkit.waitlist. Первичного ключа нет. Связь «заявка → нотация» N:1 со справочником из шести значений. Звёздочка у имени поля означает обязательное поле.</w:t>
+        <w:t>Хранилище: массив JSON в LocalStorage, ключ dslkit.waitlist. Первичного ключа нет. Звёздочка означает обязательное поле.</w:t>
       </w:r>
     </w:p>
-    <w:p>
-      <w:pPr>
-        <w:keepNext/>
-        <w:jc w:val="left"/>
-      </w:pPr>
-      <w:r>
-        <w:t>Таблица 3.2 – Данные формы: типы и допустимые значения</w:t>
-      </w:r>
-    </w:p>
-    <w:tbl>
-      <w:tblPr>
-        <w:tblW w:type="auto" w:w="0"/>
-        <w:jc w:val="center"/>
-        <w:tblLook w:firstColumn="1" w:firstRow="1" w:lastColumn="0" w:lastRow="0" w:noHBand="0" w:noVBand="1" w:val="04A0"/>
-        <w:tblBorders>
-          <w:top w:val="single" w:sz="4" w:color="000000"/>
-          <w:left w:val="single" w:sz="4" w:color="000000"/>
-          <w:bottom w:val="single" w:sz="4" w:color="000000"/>
-          <w:right w:val="single" w:sz="4" w:color="000000"/>
-          <w:insideH w:val="single" w:sz="4" w:color="000000"/>
-          <w:insideV w:val="single" w:sz="4" w:color="000000"/>
-        </w:tblBorders>
-      </w:tblPr>
-      <w:tblGrid>
-        <w:gridCol w:w="1559"/>
-        <w:gridCol w:w="1559"/>
-        <w:gridCol w:w="1559"/>
-        <w:gridCol w:w="1559"/>
-        <w:gridCol w:w="1559"/>
-        <w:gridCol w:w="1559"/>
-      </w:tblGrid>
-      <w:tr>
-        <w:tc>
-          <w:tcPr>
-            <w:tcW w:type="dxa" w:w="1559"/>
-          </w:tcPr>
-          <w:p>
-            <w:pPr>
-              <w:spacing w:line="240" w:lineRule="auto"/>
-              <w:jc w:val="center"/>
-            </w:pPr>
-            <w:r/>
-            <w:r>
-              <w:rPr>
-                <w:sz w:val="24"/>
-              </w:rPr>
-              <w:t>Поле</w:t>
-            </w:r>
-          </w:p>
-        </w:tc>
-        <w:tc>
-          <w:tcPr>
-            <w:tcW w:type="dxa" w:w="1559"/>
-          </w:tcPr>
-          <w:p>
-            <w:pPr>
-              <w:spacing w:line="240" w:lineRule="auto"/>
-              <w:jc w:val="center"/>
-            </w:pPr>
-            <w:r/>
-            <w:r>
-              <w:rPr>
-                <w:sz w:val="24"/>
-              </w:rPr>
-              <w:t>Тип</w:t>
-            </w:r>
-          </w:p>
-        </w:tc>
-        <w:tc>
-          <w:tcPr>
-            <w:tcW w:type="dxa" w:w="1559"/>
-          </w:tcPr>
-          <w:p>
-            <w:pPr>
-              <w:spacing w:line="240" w:lineRule="auto"/>
-              <w:jc w:val="center"/>
-            </w:pPr>
-            <w:r/>
-            <w:r>
-              <w:rPr>
-                <w:sz w:val="24"/>
-              </w:rPr>
-              <w:t>Обяз.</w:t>
-            </w:r>
-          </w:p>
-        </w:tc>
-        <w:tc>
-          <w:tcPr>
-            <w:tcW w:type="dxa" w:w="1559"/>
-          </w:tcPr>
-          <w:p>
-            <w:pPr>
-              <w:spacing w:line="240" w:lineRule="auto"/>
-              <w:jc w:val="center"/>
-            </w:pPr>
-            <w:r/>
-            <w:r>
-              <w:rPr>
-                <w:sz w:val="24"/>
-              </w:rPr>
-              <w:t>По умолч.</w:t>
-            </w:r>
-          </w:p>
-        </w:tc>
-        <w:tc>
-          <w:tcPr>
-            <w:tcW w:type="dxa" w:w="1559"/>
-          </w:tcPr>
-          <w:p>
-            <w:pPr>
-              <w:spacing w:line="240" w:lineRule="auto"/>
-              <w:jc w:val="center"/>
-            </w:pPr>
-            <w:r/>
-            <w:r>
-              <w:rPr>
-                <w:sz w:val="24"/>
-              </w:rPr>
-              <w:t>Допустимо</w:t>
-            </w:r>
-          </w:p>
-        </w:tc>
-        <w:tc>
-          <w:tcPr>
-            <w:tcW w:type="dxa" w:w="1559"/>
-          </w:tcPr>
-          <w:p>
-            <w:pPr>
-              <w:spacing w:line="240" w:lineRule="auto"/>
-              <w:jc w:val="center"/>
-            </w:pPr>
-            <w:r/>
-            <w:r>
-              <w:rPr>
-                <w:sz w:val="24"/>
-              </w:rPr>
-              <w:t>Недопустимо</w:t>
-            </w:r>
-          </w:p>
-        </w:tc>
-      </w:tr>
-      <w:tr>
-        <w:tc>
-          <w:tcPr>
-            <w:tcW w:type="dxa" w:w="1559"/>
-          </w:tcPr>
-          <w:p>
-            <w:pPr>
-              <w:spacing w:line="240" w:lineRule="auto"/>
-              <w:jc w:val="left"/>
-            </w:pPr>
-            <w:r/>
-            <w:r>
-              <w:rPr>
-                <w:sz w:val="24"/>
-              </w:rPr>
-              <w:t>name* (#name)</w:t>
-            </w:r>
-          </w:p>
-        </w:tc>
-        <w:tc>
-          <w:tcPr>
-            <w:tcW w:type="dxa" w:w="1559"/>
-          </w:tcPr>
-          <w:p>
-            <w:pPr>
-              <w:spacing w:line="240" w:lineRule="auto"/>
-              <w:jc w:val="left"/>
-            </w:pPr>
-            <w:r/>
-            <w:r>
-              <w:rPr>
-                <w:sz w:val="24"/>
-              </w:rPr>
-              <w:t>string; input type=text</w:t>
-            </w:r>
-          </w:p>
-        </w:tc>
-        <w:tc>
-          <w:tcPr>
-            <w:tcW w:type="dxa" w:w="1559"/>
-          </w:tcPr>
-          <w:p>
-            <w:pPr>
-              <w:spacing w:line="240" w:lineRule="auto"/>
-              <w:jc w:val="left"/>
-            </w:pPr>
-            <w:r/>
-            <w:r>
-              <w:rPr>
-                <w:sz w:val="24"/>
-              </w:rPr>
-              <w:t>Да</w:t>
-            </w:r>
-          </w:p>
-        </w:tc>
-        <w:tc>
-          <w:tcPr>
-            <w:tcW w:type="dxa" w:w="1559"/>
-          </w:tcPr>
-          <w:p>
-            <w:pPr>
-              <w:spacing w:line="240" w:lineRule="auto"/>
-              <w:jc w:val="left"/>
-            </w:pPr>
-            <w:r/>
-            <w:r>
-              <w:rPr>
-                <w:sz w:val="24"/>
-              </w:rPr>
-              <w:t>пусто</w:t>
-            </w:r>
-          </w:p>
-        </w:tc>
-        <w:tc>
-          <w:tcPr>
-            <w:tcW w:type="dxa" w:w="1559"/>
-          </w:tcPr>
-          <w:p>
-            <w:pPr>
-              <w:spacing w:line="240" w:lineRule="auto"/>
-              <w:jc w:val="left"/>
-            </w:pPr>
-            <w:r/>
-            <w:r>
-              <w:rPr>
-                <w:sz w:val="24"/>
-              </w:rPr>
-              <w:t>От 2 до 60 символов; первая буква, далее буквы любого алфавита, пробел, апостроф, дефис; пробелы по краям игнорируются. Примеры: «Анна Иванова», «Ян», «O'Neil-Smith»</w:t>
-            </w:r>
-          </w:p>
-        </w:tc>
-        <w:tc>
-          <w:tcPr>
-            <w:tcW w:type="dxa" w:w="1559"/>
-          </w:tcPr>
-          <w:p>
-            <w:pPr>
-              <w:spacing w:line="240" w:lineRule="auto"/>
-              <w:jc w:val="left"/>
-            </w:pPr>
-            <w:r/>
-            <w:r>
-              <w:rPr>
-                <w:sz w:val="24"/>
-              </w:rPr>
-              <w:t>Пусто; 1 символ; 61 и более; цифры («Anna1»); знаки («Анна!»); первый символ не буква («-Анна»)</w:t>
-            </w:r>
-          </w:p>
-        </w:tc>
-      </w:tr>
-      <w:tr>
-        <w:tc>
-          <w:tcPr>
-            <w:tcW w:type="dxa" w:w="1559"/>
-          </w:tcPr>
-          <w:p>
-            <w:pPr>
-              <w:spacing w:line="240" w:lineRule="auto"/>
-              <w:jc w:val="left"/>
-            </w:pPr>
-            <w:r/>
-            <w:r>
-              <w:rPr>
-                <w:sz w:val="24"/>
-              </w:rPr>
-              <w:t>email* (#email)</w:t>
-            </w:r>
-          </w:p>
-        </w:tc>
-        <w:tc>
-          <w:tcPr>
-            <w:tcW w:type="dxa" w:w="1559"/>
-          </w:tcPr>
-          <w:p>
-            <w:pPr>
-              <w:spacing w:line="240" w:lineRule="auto"/>
-              <w:jc w:val="left"/>
-            </w:pPr>
-            <w:r/>
-            <w:r>
-              <w:rPr>
-                <w:sz w:val="24"/>
-              </w:rPr>
-              <w:t>string; input type=email</w:t>
-            </w:r>
-          </w:p>
-        </w:tc>
-        <w:tc>
-          <w:tcPr>
-            <w:tcW w:type="dxa" w:w="1559"/>
-          </w:tcPr>
-          <w:p>
-            <w:pPr>
-              <w:spacing w:line="240" w:lineRule="auto"/>
-              <w:jc w:val="left"/>
-            </w:pPr>
-            <w:r/>
-            <w:r>
-              <w:rPr>
-                <w:sz w:val="24"/>
-              </w:rPr>
-              <w:t>Да</w:t>
-            </w:r>
-          </w:p>
-        </w:tc>
-        <w:tc>
-          <w:tcPr>
-            <w:tcW w:type="dxa" w:w="1559"/>
-          </w:tcPr>
-          <w:p>
-            <w:pPr>
-              <w:spacing w:line="240" w:lineRule="auto"/>
-              <w:jc w:val="left"/>
-            </w:pPr>
-            <w:r/>
-            <w:r>
-              <w:rPr>
-                <w:sz w:val="24"/>
-              </w:rPr>
-              <w:t>пусто</w:t>
-            </w:r>
-          </w:p>
-        </w:tc>
-        <w:tc>
-          <w:tcPr>
-            <w:tcW w:type="dxa" w:w="1559"/>
-          </w:tcPr>
-          <w:p>
-            <w:pPr>
-              <w:spacing w:line="240" w:lineRule="auto"/>
-              <w:jc w:val="left"/>
-            </w:pPr>
-            <w:r/>
-            <w:r>
-              <w:rPr>
-                <w:sz w:val="24"/>
-              </w:rPr>
-              <w:t>Вид name@domain.zone, зона не короче 2 символов, до 120 символов. Пример: anna@example.com</w:t>
-            </w:r>
-          </w:p>
-        </w:tc>
-        <w:tc>
-          <w:tcPr>
-            <w:tcW w:type="dxa" w:w="1559"/>
-          </w:tcPr>
-          <w:p>
-            <w:pPr>
-              <w:spacing w:line="240" w:lineRule="auto"/>
-              <w:jc w:val="left"/>
-            </w:pPr>
-            <w:r/>
-            <w:r>
-              <w:rPr>
-                <w:sz w:val="24"/>
-              </w:rPr>
-              <w:t>Пусто; без @; без зоны («anna@example»); пробелы внутри; 121 символ и более</w:t>
-            </w:r>
-          </w:p>
-        </w:tc>
-      </w:tr>
-      <w:tr>
-        <w:tc>
-          <w:tcPr>
-            <w:tcW w:type="dxa" w:w="1559"/>
-          </w:tcPr>
-          <w:p>
-            <w:pPr>
-              <w:spacing w:line="240" w:lineRule="auto"/>
-              <w:jc w:val="left"/>
-            </w:pPr>
-            <w:r/>
-            <w:r>
-              <w:rPr>
-                <w:sz w:val="24"/>
-              </w:rPr>
-              <w:t>notation* (#notation)</w:t>
-            </w:r>
-          </w:p>
-        </w:tc>
-        <w:tc>
-          <w:tcPr>
-            <w:tcW w:type="dxa" w:w="1559"/>
-          </w:tcPr>
-          <w:p>
-            <w:pPr>
-              <w:spacing w:line="240" w:lineRule="auto"/>
-              <w:jc w:val="left"/>
-            </w:pPr>
-            <w:r/>
-            <w:r>
-              <w:rPr>
-                <w:sz w:val="24"/>
-              </w:rPr>
-              <w:t>enum; select, значение string</w:t>
-            </w:r>
-          </w:p>
-        </w:tc>
-        <w:tc>
-          <w:tcPr>
-            <w:tcW w:type="dxa" w:w="1559"/>
-          </w:tcPr>
-          <w:p>
-            <w:pPr>
-              <w:spacing w:line="240" w:lineRule="auto"/>
-              <w:jc w:val="left"/>
-            </w:pPr>
-            <w:r/>
-            <w:r>
-              <w:rPr>
-                <w:sz w:val="24"/>
-              </w:rPr>
-              <w:t>Да</w:t>
-            </w:r>
-          </w:p>
-        </w:tc>
-        <w:tc>
-          <w:tcPr>
-            <w:tcW w:type="dxa" w:w="1559"/>
-          </w:tcPr>
-          <w:p>
-            <w:pPr>
-              <w:spacing w:line="240" w:lineRule="auto"/>
-              <w:jc w:val="left"/>
-            </w:pPr>
-            <w:r/>
-            <w:r>
-              <w:rPr>
-                <w:sz w:val="24"/>
-              </w:rPr>
-              <w:t>не выбрано</w:t>
-            </w:r>
-          </w:p>
-        </w:tc>
-        <w:tc>
-          <w:tcPr>
-            <w:tcW w:type="dxa" w:w="1559"/>
-          </w:tcPr>
-          <w:p>
-            <w:pPr>
-              <w:spacing w:line="240" w:lineRule="auto"/>
-              <w:jc w:val="left"/>
-            </w:pPr>
-            <w:r/>
-            <w:r>
-              <w:rPr>
-                <w:sz w:val="24"/>
-              </w:rPr>
-              <w:t>Ровно одно из: idef0, dfd, erd, bpmn, uml, petri</w:t>
-            </w:r>
-          </w:p>
-        </w:tc>
-        <w:tc>
-          <w:tcPr>
-            <w:tcW w:type="dxa" w:w="1559"/>
-          </w:tcPr>
-          <w:p>
-            <w:pPr>
-              <w:spacing w:line="240" w:lineRule="auto"/>
-              <w:jc w:val="left"/>
-            </w:pPr>
-            <w:r/>
-            <w:r>
-              <w:rPr>
-                <w:sz w:val="24"/>
-              </w:rPr>
-              <w:t>Пусто (пункт «Выберите нотацию»); любое другое значение («xyz»); заглавные буквы («IDEF0»)</w:t>
-            </w:r>
-          </w:p>
-        </w:tc>
-      </w:tr>
-      <w:tr>
-        <w:tc>
-          <w:tcPr>
-            <w:tcW w:type="dxa" w:w="1559"/>
-          </w:tcPr>
-          <w:p>
-            <w:pPr>
-              <w:spacing w:line="240" w:lineRule="auto"/>
-              <w:jc w:val="left"/>
-            </w:pPr>
-            <w:r/>
-            <w:r>
-              <w:rPr>
-                <w:sz w:val="24"/>
-              </w:rPr>
-              <w:t>team* (#team)</w:t>
-            </w:r>
-          </w:p>
-        </w:tc>
-        <w:tc>
-          <w:tcPr>
-            <w:tcW w:type="dxa" w:w="1559"/>
-          </w:tcPr>
-          <w:p>
-            <w:pPr>
-              <w:spacing w:line="240" w:lineRule="auto"/>
-              <w:jc w:val="left"/>
-            </w:pPr>
-            <w:r/>
-            <w:r>
-              <w:rPr>
-                <w:sz w:val="24"/>
-              </w:rPr>
-              <w:t>integer; input type=number (в коде допускается и строка из цифр)</w:t>
-            </w:r>
-          </w:p>
-        </w:tc>
-        <w:tc>
-          <w:tcPr>
-            <w:tcW w:type="dxa" w:w="1559"/>
-          </w:tcPr>
-          <w:p>
-            <w:pPr>
-              <w:spacing w:line="240" w:lineRule="auto"/>
-              <w:jc w:val="left"/>
-            </w:pPr>
-            <w:r/>
-            <w:r>
-              <w:rPr>
-                <w:sz w:val="24"/>
-              </w:rPr>
-              <w:t>Да</w:t>
-            </w:r>
-          </w:p>
-        </w:tc>
-        <w:tc>
-          <w:tcPr>
-            <w:tcW w:type="dxa" w:w="1559"/>
-          </w:tcPr>
-          <w:p>
-            <w:pPr>
-              <w:spacing w:line="240" w:lineRule="auto"/>
-              <w:jc w:val="left"/>
-            </w:pPr>
-            <w:r/>
-            <w:r>
-              <w:rPr>
-                <w:sz w:val="24"/>
-              </w:rPr>
-              <w:t>0</w:t>
-            </w:r>
-          </w:p>
-        </w:tc>
-        <w:tc>
-          <w:tcPr>
-            <w:tcW w:type="dxa" w:w="1559"/>
-          </w:tcPr>
-          <w:p>
-            <w:pPr>
-              <w:spacing w:line="240" w:lineRule="auto"/>
-              <w:jc w:val="left"/>
-            </w:pPr>
-            <w:r/>
-            <w:r>
-              <w:rPr>
-                <w:sz w:val="24"/>
-              </w:rPr>
-              <w:t>Целое от 0 до 500 включительно. Примеры: 0, 5, 500, «12»</w:t>
-            </w:r>
-          </w:p>
-        </w:tc>
-        <w:tc>
-          <w:tcPr>
-            <w:tcW w:type="dxa" w:w="1559"/>
-          </w:tcPr>
-          <w:p>
-            <w:pPr>
-              <w:spacing w:line="240" w:lineRule="auto"/>
-              <w:jc w:val="left"/>
-            </w:pPr>
-            <w:r/>
-            <w:r>
-              <w:rPr>
-                <w:sz w:val="24"/>
-              </w:rPr>
-              <w:t>Меньше 0 («-1»); больше 500 («501»); дробное («2.5»); не число («abc»); пусто</w:t>
-            </w:r>
-          </w:p>
-        </w:tc>
-      </w:tr>
-      <w:tr>
-        <w:tc>
-          <w:tcPr>
-            <w:tcW w:type="dxa" w:w="1559"/>
-          </w:tcPr>
-          <w:p>
-            <w:pPr>
-              <w:spacing w:line="240" w:lineRule="auto"/>
-              <w:jc w:val="left"/>
-            </w:pPr>
-            <w:r/>
-            <w:r>
-              <w:rPr>
-                <w:sz w:val="24"/>
-              </w:rPr>
-              <w:t>comment (#comment)</w:t>
-            </w:r>
-          </w:p>
-        </w:tc>
-        <w:tc>
-          <w:tcPr>
-            <w:tcW w:type="dxa" w:w="1559"/>
-          </w:tcPr>
-          <w:p>
-            <w:pPr>
-              <w:spacing w:line="240" w:lineRule="auto"/>
-              <w:jc w:val="left"/>
-            </w:pPr>
-            <w:r/>
-            <w:r>
-              <w:rPr>
-                <w:sz w:val="24"/>
-              </w:rPr>
-              <w:t>string; textarea</w:t>
-            </w:r>
-          </w:p>
-        </w:tc>
-        <w:tc>
-          <w:tcPr>
-            <w:tcW w:type="dxa" w:w="1559"/>
-          </w:tcPr>
-          <w:p>
-            <w:pPr>
-              <w:spacing w:line="240" w:lineRule="auto"/>
-              <w:jc w:val="left"/>
-            </w:pPr>
-            <w:r/>
-            <w:r>
-              <w:rPr>
-                <w:sz w:val="24"/>
-              </w:rPr>
-              <w:t>Нет</w:t>
-            </w:r>
-          </w:p>
-        </w:tc>
-        <w:tc>
-          <w:tcPr>
-            <w:tcW w:type="dxa" w:w="1559"/>
-          </w:tcPr>
-          <w:p>
-            <w:pPr>
-              <w:spacing w:line="240" w:lineRule="auto"/>
-              <w:jc w:val="left"/>
-            </w:pPr>
-            <w:r/>
-            <w:r>
-              <w:rPr>
-                <w:sz w:val="24"/>
-              </w:rPr>
-              <w:t>пусто</w:t>
-            </w:r>
-          </w:p>
-        </w:tc>
-        <w:tc>
-          <w:tcPr>
-            <w:tcW w:type="dxa" w:w="1559"/>
-          </w:tcPr>
-          <w:p>
-            <w:pPr>
-              <w:spacing w:line="240" w:lineRule="auto"/>
-              <w:jc w:val="left"/>
-            </w:pPr>
-            <w:r/>
-            <w:r>
-              <w:rPr>
-                <w:sz w:val="24"/>
-              </w:rPr>
-              <w:t>От 0 до 500 символов (пусто допустимо)</w:t>
-            </w:r>
-          </w:p>
-        </w:tc>
-        <w:tc>
-          <w:tcPr>
-            <w:tcW w:type="dxa" w:w="1559"/>
-          </w:tcPr>
-          <w:p>
-            <w:pPr>
-              <w:spacing w:line="240" w:lineRule="auto"/>
-              <w:jc w:val="left"/>
-            </w:pPr>
-            <w:r/>
-            <w:r>
-              <w:rPr>
-                <w:sz w:val="24"/>
-              </w:rPr>
-              <w:t>501 символ и более (в браузере ввод ограничен maxlength=500)</w:t>
-            </w:r>
-          </w:p>
-        </w:tc>
-      </w:tr>
-      <w:tr>
-        <w:tc>
-          <w:tcPr>
-            <w:tcW w:type="dxa" w:w="1559"/>
-          </w:tcPr>
-          <w:p>
-            <w:pPr>
-              <w:spacing w:line="240" w:lineRule="auto"/>
-              <w:jc w:val="left"/>
-            </w:pPr>
-            <w:r/>
-            <w:r>
-              <w:rPr>
-                <w:sz w:val="24"/>
-              </w:rPr>
-              <w:t>consent* (#consent)</w:t>
-            </w:r>
-          </w:p>
-        </w:tc>
-        <w:tc>
-          <w:tcPr>
-            <w:tcW w:type="dxa" w:w="1559"/>
-          </w:tcPr>
-          <w:p>
-            <w:pPr>
-              <w:spacing w:line="240" w:lineRule="auto"/>
-              <w:jc w:val="left"/>
-            </w:pPr>
-            <w:r/>
-            <w:r>
-              <w:rPr>
-                <w:sz w:val="24"/>
-              </w:rPr>
-              <w:t>boolean; checkbox</w:t>
-            </w:r>
-          </w:p>
-        </w:tc>
-        <w:tc>
-          <w:tcPr>
-            <w:tcW w:type="dxa" w:w="1559"/>
-          </w:tcPr>
-          <w:p>
-            <w:pPr>
-              <w:spacing w:line="240" w:lineRule="auto"/>
-              <w:jc w:val="left"/>
-            </w:pPr>
-            <w:r/>
-            <w:r>
-              <w:rPr>
-                <w:sz w:val="24"/>
-              </w:rPr>
-              <w:t>Да</w:t>
-            </w:r>
-          </w:p>
-        </w:tc>
-        <w:tc>
-          <w:tcPr>
-            <w:tcW w:type="dxa" w:w="1559"/>
-          </w:tcPr>
-          <w:p>
-            <w:pPr>
-              <w:spacing w:line="240" w:lineRule="auto"/>
-              <w:jc w:val="left"/>
-            </w:pPr>
-            <w:r/>
-            <w:r>
-              <w:rPr>
-                <w:sz w:val="24"/>
-              </w:rPr>
-              <w:t>false (снят)</w:t>
-            </w:r>
-          </w:p>
-        </w:tc>
-        <w:tc>
-          <w:tcPr>
-            <w:tcW w:type="dxa" w:w="1559"/>
-          </w:tcPr>
-          <w:p>
-            <w:pPr>
-              <w:spacing w:line="240" w:lineRule="auto"/>
-              <w:jc w:val="left"/>
-            </w:pPr>
-            <w:r/>
-            <w:r>
-              <w:rPr>
-                <w:sz w:val="24"/>
-              </w:rPr>
-              <w:t>true (флажок отмечен)</w:t>
-            </w:r>
-          </w:p>
-        </w:tc>
-        <w:tc>
-          <w:tcPr>
-            <w:tcW w:type="dxa" w:w="1559"/>
-          </w:tcPr>
-          <w:p>
-            <w:pPr>
-              <w:spacing w:line="240" w:lineRule="auto"/>
-              <w:jc w:val="left"/>
-            </w:pPr>
-            <w:r/>
-            <w:r>
-              <w:rPr>
-                <w:sz w:val="24"/>
-              </w:rPr>
-              <w:t>false (флажок снят)</w:t>
-            </w:r>
-          </w:p>
-        </w:tc>
-      </w:tr>
-      <w:tr>
-        <w:tc>
-          <w:tcPr>
-            <w:tcW w:type="dxa" w:w="1559"/>
-          </w:tcPr>
-          <w:p>
-            <w:pPr>
-              <w:spacing w:line="240" w:lineRule="auto"/>
-              <w:jc w:val="left"/>
-            </w:pPr>
-            <w:r/>
-            <w:r>
-              <w:rPr>
-                <w:sz w:val="24"/>
-              </w:rPr>
-              <w:t>createdAt (формирует система)</w:t>
-            </w:r>
-          </w:p>
-        </w:tc>
-        <w:tc>
-          <w:tcPr>
-            <w:tcW w:type="dxa" w:w="1559"/>
-          </w:tcPr>
-          <w:p>
-            <w:pPr>
-              <w:spacing w:line="240" w:lineRule="auto"/>
-              <w:jc w:val="left"/>
-            </w:pPr>
-            <w:r/>
-            <w:r>
-              <w:rPr>
-                <w:sz w:val="24"/>
-              </w:rPr>
-              <w:t>string; время ISO 8601 (UTC)</w:t>
-            </w:r>
-          </w:p>
-        </w:tc>
-        <w:tc>
-          <w:tcPr>
-            <w:tcW w:type="dxa" w:w="1559"/>
-          </w:tcPr>
-          <w:p>
-            <w:pPr>
-              <w:spacing w:line="240" w:lineRule="auto"/>
-              <w:jc w:val="left"/>
-            </w:pPr>
-            <w:r/>
-            <w:r>
-              <w:rPr>
-                <w:sz w:val="24"/>
-              </w:rPr>
-              <w:t>Нет (не вводится)</w:t>
-            </w:r>
-          </w:p>
-        </w:tc>
-        <w:tc>
-          <w:tcPr>
-            <w:tcW w:type="dxa" w:w="1559"/>
-          </w:tcPr>
-          <w:p>
-            <w:pPr>
-              <w:spacing w:line="240" w:lineRule="auto"/>
-              <w:jc w:val="left"/>
-            </w:pPr>
-            <w:r/>
-            <w:r>
-              <w:rPr>
-                <w:sz w:val="24"/>
-              </w:rPr>
-              <w:t>текущее время в момент отправки</w:t>
-            </w:r>
-          </w:p>
-        </w:tc>
-        <w:tc>
-          <w:tcPr>
-            <w:tcW w:type="dxa" w:w="1559"/>
-          </w:tcPr>
-          <w:p>
-            <w:pPr>
-              <w:spacing w:line="240" w:lineRule="auto"/>
-              <w:jc w:val="left"/>
-            </w:pPr>
-            <w:r/>
-            <w:r>
-              <w:rPr>
-                <w:sz w:val="24"/>
-              </w:rPr>
-              <w:t>Строка вида 2026-10-25T12:00:00.000Z</w:t>
-            </w:r>
-          </w:p>
-        </w:tc>
-        <w:tc>
-          <w:tcPr>
-            <w:tcW w:type="dxa" w:w="1559"/>
-          </w:tcPr>
-          <w:p>
-            <w:pPr>
-              <w:spacing w:line="240" w:lineRule="auto"/>
-              <w:jc w:val="left"/>
-            </w:pPr>
-            <w:r/>
-            <w:r>
-              <w:rPr>
-                <w:sz w:val="24"/>
-              </w:rPr>
-              <w:t>Не вводится посетителем</w:t>
-            </w:r>
-          </w:p>
-        </w:tc>
-      </w:tr>
-    </w:tbl>
-    <w:p/>
     <w:p>
       <w:pPr>
         <w:pStyle w:val="Heading2"/>
@@ -4803,7 +2489,7 @@
         <w:rPr>
           <w:b/>
         </w:rPr>
-        <w:t>3.2 Диаграммы процесса</w:t>
+        <w:t>3.2 Диаграмма и скриншоты</w:t>
       </w:r>
     </w:p>
     <w:p>
@@ -4814,7 +2500,7 @@
       <w:r>
         <w:drawing>
           <wp:inline xmlns:a="http://schemas.openxmlformats.org/drawingml/2006/main" xmlns:pic="http://schemas.openxmlformats.org/drawingml/2006/picture">
-            <wp:extent cx="3952434" cy="7199999"/>
+            <wp:extent cx="5580000" cy="5615769"/>
             <wp:docPr id="1" name="Picture 1"/>
             <wp:cNvGraphicFramePr>
               <a:graphicFrameLocks noChangeAspect="1"/>
@@ -4835,7 +2521,7 @@
                   <pic:spPr>
                     <a:xfrm>
                       <a:off x="0" y="0"/>
-                      <a:ext cx="3952434" cy="7199999"/>
+                      <a:ext cx="5580000" cy="5615769"/>
                     </a:xfrm>
                     <a:prstGeom prst="rect"/>
                   </pic:spPr>
@@ -4863,7 +2549,7 @@
       <w:r>
         <w:drawing>
           <wp:inline xmlns:a="http://schemas.openxmlformats.org/drawingml/2006/main" xmlns:pic="http://schemas.openxmlformats.org/drawingml/2006/picture">
-            <wp:extent cx="5580000" cy="1411542"/>
+            <wp:extent cx="5549132" cy="7199999"/>
             <wp:docPr id="2" name="Picture 2"/>
             <wp:cNvGraphicFramePr>
               <a:graphicFrameLocks noChangeAspect="1"/>
@@ -4872,7 +2558,7 @@
               <a:graphicData uri="http://schemas.openxmlformats.org/drawingml/2006/picture">
                 <pic:pic>
                   <pic:nvPicPr>
-                    <pic:cNvPr id="0" name="states.png"/>
+                    <pic:cNvPr id="0" name="shot-errors.png"/>
                     <pic:cNvPicPr/>
                   </pic:nvPicPr>
                   <pic:blipFill>
@@ -4884,7 +2570,7 @@
                   <pic:spPr>
                     <a:xfrm>
                       <a:off x="0" y="0"/>
-                      <a:ext cx="5580000" cy="1411542"/>
+                      <a:ext cx="5549132" cy="7199999"/>
                     </a:xfrm>
                     <a:prstGeom prst="rect"/>
                   </pic:spPr>
@@ -4900,7 +2586,7 @@
         <w:jc w:val="center"/>
       </w:pPr>
       <w:r>
-        <w:t>Рисунок 3.2 – Состояния поля формы при проверке</w:t>
+        <w:t>Рисунок 3.2 – Форма: ошибки при пустой отправке</w:t>
       </w:r>
     </w:p>
     <w:p/>
@@ -4912,7 +2598,7 @@
       <w:r>
         <w:drawing>
           <wp:inline xmlns:a="http://schemas.openxmlformats.org/drawingml/2006/main" xmlns:pic="http://schemas.openxmlformats.org/drawingml/2006/picture">
-            <wp:extent cx="5580000" cy="950875"/>
+            <wp:extent cx="5580000" cy="6328650"/>
             <wp:docPr id="3" name="Picture 3"/>
             <wp:cNvGraphicFramePr>
               <a:graphicFrameLocks noChangeAspect="1"/>
@@ -4921,7 +2607,7 @@
               <a:graphicData uri="http://schemas.openxmlformats.org/drawingml/2006/picture">
                 <pic:pic>
                   <pic:nvPicPr>
-                    <pic:cNvPr id="0" name="components.png"/>
+                    <pic:cNvPr id="0" name="shot-filled.png"/>
                     <pic:cNvPicPr/>
                   </pic:nvPicPr>
                   <pic:blipFill>
@@ -4933,7 +2619,7 @@
                   <pic:spPr>
                     <a:xfrm>
                       <a:off x="0" y="0"/>
-                      <a:ext cx="5580000" cy="950875"/>
+                      <a:ext cx="5580000" cy="6328650"/>
                     </a:xfrm>
                     <a:prstGeom prst="rect"/>
                   </pic:spPr>
@@ -4949,7 +2635,56 @@
         <w:jc w:val="center"/>
       </w:pPr>
       <w:r>
-        <w:t>Рисунок 3.3 – Компоненты и обмен данными</w:t>
+        <w:t>Рисунок 3.3 – Форма заполнена корректными данными</w:t>
+      </w:r>
+    </w:p>
+    <w:p/>
+    <w:p>
+      <w:pPr>
+        <w:keepNext/>
+        <w:jc w:val="center"/>
+      </w:pPr>
+      <w:r>
+        <w:drawing>
+          <wp:inline xmlns:a="http://schemas.openxmlformats.org/drawingml/2006/main" xmlns:pic="http://schemas.openxmlformats.org/drawingml/2006/picture">
+            <wp:extent cx="5580000" cy="3487500"/>
+            <wp:docPr id="4" name="Picture 4"/>
+            <wp:cNvGraphicFramePr>
+              <a:graphicFrameLocks noChangeAspect="1"/>
+            </wp:cNvGraphicFramePr>
+            <a:graphic>
+              <a:graphicData uri="http://schemas.openxmlformats.org/drawingml/2006/picture">
+                <pic:pic>
+                  <pic:nvPicPr>
+                    <pic:cNvPr id="0" name="shot-thanks.png"/>
+                    <pic:cNvPicPr/>
+                  </pic:nvPicPr>
+                  <pic:blipFill>
+                    <a:blip r:embed="rId13"/>
+                    <a:stretch>
+                      <a:fillRect/>
+                    </a:stretch>
+                  </pic:blipFill>
+                  <pic:spPr>
+                    <a:xfrm>
+                      <a:off x="0" y="0"/>
+                      <a:ext cx="5580000" cy="3487500"/>
+                    </a:xfrm>
+                    <a:prstGeom prst="rect"/>
+                  </pic:spPr>
+                </pic:pic>
+              </a:graphicData>
+            </a:graphic>
+          </wp:inline>
+        </w:drawing>
+      </w:r>
+    </w:p>
+    <w:p>
+      <w:pPr>
+        <w:jc w:val="center"/>
+      </w:pPr>
+      <w:r>
+        <w:t>Рисунок 3.4 – Страница благодарности</w:t>
       </w:r>
     </w:p>
     <w:p/>
@@ -4977,7 +2712,7 @@
         <w:jc w:val="left"/>
       </w:pPr>
       <w:r>
-        <w:t>Таблица 3.3 – Требования к полям формы</w:t>
+        <w:t>Таблица 3.2 – Требования к полям формы</w:t>
       </w:r>
     </w:p>
     <w:tbl>
@@ -5294,7 +3029,7 @@
         <w:jc w:val="left"/>
       </w:pPr>
       <w:r>
-        <w:t>Таблица 3.4 – Классы эквивалентности и граничные значения</w:t>
+        <w:t>Таблица 3.3 – Классы эквивалентности и граничные значения</w:t>
       </w:r>
     </w:p>
     <w:tbl>
@@ -5865,7 +3600,7 @@
         <w:jc w:val="left"/>
       </w:pPr>
       <w:r>
-        <w:t>Таблица 3.5 – Тест-кейсы и результаты выполнения</w:t>
+        <w:t>Таблица 3.4 – Тест-кейсы и результаты выполнения</w:t>
       </w:r>
     </w:p>
     <w:tbl>

</xml_diff>